<commit_message>
feat: add README and refactor
</commit_message>
<xml_diff>
--- a/_resources/readme/README.docx
+++ b/_resources/readme/README.docx
@@ -20,82 +20,1449 @@
     <w:p>
       <w:pPr>
         <w:rPr>
+          <w:rFonts w:cstheme="majorHAnsi"/>
+          <w:szCs w:val="22"/>
+        </w:rPr>
+      </w:pPr>
+      <w:r>
+        <w:rPr>
+          <w:rFonts w:cstheme="majorHAnsi"/>
+          <w:szCs w:val="22"/>
+        </w:rPr>
+        <w:t xml:space="preserve">This repository </w:t>
+      </w:r>
+      <w:r>
+        <w:rPr>
+          <w:rFonts w:cstheme="majorHAnsi"/>
+          <w:szCs w:val="22"/>
+        </w:rPr>
+        <w:t>contains</w:t>
+      </w:r>
+      <w:r>
+        <w:rPr>
+          <w:rFonts w:cstheme="majorHAnsi"/>
+          <w:szCs w:val="22"/>
+        </w:rPr>
+        <w:t xml:space="preserve"> the source code for my e-commerce website, using ASP.NET Core backend, React.js with TypeScript frontend, and SaaS integrations such as Stripe for payments and </w:t>
+      </w:r>
+      <w:proofErr w:type="spellStart"/>
+      <w:r>
+        <w:rPr>
+          <w:rFonts w:cstheme="majorHAnsi"/>
+          <w:szCs w:val="22"/>
+        </w:rPr>
+        <w:t>Cloudinary</w:t>
+      </w:r>
+      <w:proofErr w:type="spellEnd"/>
+      <w:r>
+        <w:rPr>
+          <w:rFonts w:cstheme="majorHAnsi"/>
+          <w:szCs w:val="22"/>
+        </w:rPr>
+        <w:t xml:space="preserve"> for image storage. </w:t>
+      </w:r>
+      <w:bookmarkStart w:id="1" w:name="_Hlk151740029"/>
+      <w:r>
+        <w:rPr>
+          <w:rFonts w:cstheme="majorHAnsi"/>
+          <w:szCs w:val="22"/>
+        </w:rPr>
+        <w:t xml:space="preserve">Access the website at </w:t>
+      </w:r>
+      <w:hyperlink r:id="rId8" w:history="1">
+        <w:r>
+          <w:rPr>
+            <w:rStyle w:val="af0"/>
+            <w:rFonts w:cstheme="majorHAnsi"/>
+            <w:sz w:val="22"/>
+            <w:szCs w:val="22"/>
+          </w:rPr>
+          <w:t>https://myshop20230101.azurewebsites.net</w:t>
+        </w:r>
+      </w:hyperlink>
+      <w:r>
+        <w:rPr>
+          <w:rFonts w:cstheme="majorHAnsi"/>
+          <w:szCs w:val="22"/>
+        </w:rPr>
+        <w:t>.</w:t>
+      </w:r>
+    </w:p>
+    <w:bookmarkEnd w:id="1"/>
+    <w:p>
+      <w:pPr>
+        <w:rPr>
+          <w:lang w:val="en-AU"/>
+        </w:rPr>
+      </w:pPr>
+    </w:p>
+    <w:p>
+      <w:pPr>
+        <w:pStyle w:val="2"/>
+        <w:rPr>
+          <w:lang w:val="en-AU"/>
+        </w:rPr>
+      </w:pPr>
+      <w:bookmarkStart w:id="2" w:name="_Hlk151022594"/>
+      <w:r>
+        <w:rPr>
+          <w:lang w:val="en-AU"/>
+        </w:rPr>
+        <w:t>Getting Started</w:t>
+      </w:r>
+    </w:p>
+    <w:p>
+      <w:r>
+        <w:rPr>
+          <w:shd w:val="clear" w:color="auto" w:fill="FFFFFF"/>
+        </w:rPr>
+        <w:t>Clone the reposit</w:t>
+      </w:r>
+      <w:r>
+        <w:rPr>
+          <w:shd w:val="clear" w:color="auto" w:fill="FFFFFF"/>
+        </w:rPr>
+        <w:t xml:space="preserve">ory and run in development mode in Visual Studio. </w:t>
+      </w:r>
+      <w:r>
+        <w:rPr>
+          <w:shd w:val="clear" w:color="auto" w:fill="FFFFFF"/>
+        </w:rPr>
+        <w:t xml:space="preserve">Register with Stripe and </w:t>
+      </w:r>
+      <w:proofErr w:type="spellStart"/>
+      <w:r>
+        <w:t>Cloudinary</w:t>
+      </w:r>
+      <w:proofErr w:type="spellEnd"/>
+      <w:r>
+        <w:t xml:space="preserve"> to enable payment services and image storage services.</w:t>
+      </w:r>
+    </w:p>
+    <w:p>
+      <w:pPr>
+        <w:pStyle w:val="3"/>
+        <w:rPr>
+          <w:lang w:val="en-AU"/>
+        </w:rPr>
+      </w:pPr>
+      <w:bookmarkStart w:id="3" w:name="_Hlk151740021"/>
+      <w:r>
+        <w:rPr>
+          <w:lang w:val="en-AU"/>
+        </w:rPr>
+        <w:t>Testing Accounts</w:t>
+      </w:r>
+    </w:p>
+    <w:p>
+      <w:pPr>
+        <w:rPr>
+          <w:lang w:val="en-AU"/>
+        </w:rPr>
+      </w:pPr>
+      <w:r>
+        <w:rPr>
+          <w:lang w:val="en-AU"/>
+        </w:rPr>
+        <w:t>Use the following accounts to log in. An administrator user can create or update products while a normal user cannot.</w:t>
+      </w:r>
+    </w:p>
+    <w:tbl>
+      <w:tblPr>
+        <w:tblW w:w="0" w:type="auto"/>
+        <w:tblInd w:w="1110" w:type="dxa"/>
+        <w:tblBorders>
+          <w:top w:val="single" w:sz="8" w:space="0" w:color="A3A3A3"/>
+          <w:left w:val="single" w:sz="8" w:space="0" w:color="A3A3A3"/>
+          <w:bottom w:val="single" w:sz="8" w:space="0" w:color="A3A3A3"/>
+          <w:right w:val="single" w:sz="8" w:space="0" w:color="A3A3A3"/>
+        </w:tblBorders>
+        <w:tblCellMar>
+          <w:left w:w="0" w:type="dxa"/>
+          <w:right w:w="0" w:type="dxa"/>
+        </w:tblCellMar>
+        <w:tblLook w:val="04A0" w:firstRow="1" w:lastRow="0" w:firstColumn="1" w:lastColumn="0" w:noHBand="0" w:noVBand="1"/>
+      </w:tblPr>
+      <w:tblGrid>
+        <w:gridCol w:w="1097"/>
+        <w:gridCol w:w="1623"/>
+        <w:gridCol w:w="1263"/>
+        <w:gridCol w:w="1441"/>
+      </w:tblGrid>
+      <w:tr>
+        <w:tc>
+          <w:tcPr>
+            <w:tcW w:w="1080" w:type="dxa"/>
+            <w:tcBorders>
+              <w:top w:val="single" w:sz="8" w:space="0" w:color="A3A3A3"/>
+              <w:left w:val="single" w:sz="8" w:space="0" w:color="A3A3A3"/>
+              <w:bottom w:val="single" w:sz="8" w:space="0" w:color="A3A3A3"/>
+              <w:right w:val="single" w:sz="8" w:space="0" w:color="A3A3A3"/>
+            </w:tcBorders>
+            <w:tcMar>
+              <w:top w:w="80" w:type="dxa"/>
+              <w:left w:w="80" w:type="dxa"/>
+              <w:bottom w:w="80" w:type="dxa"/>
+              <w:right w:w="80" w:type="dxa"/>
+            </w:tcMar>
+          </w:tcPr>
+          <w:p>
+            <w:pPr>
+              <w:spacing w:after="0" w:line="240" w:lineRule="auto"/>
+              <w:rPr>
+                <w:rFonts w:ascii="Calibri" w:eastAsia="Times New Roman" w:hAnsi="Calibri" w:cs="Calibri"/>
+                <w:b/>
+                <w:bCs/>
+                <w:szCs w:val="22"/>
+                <w:lang w:val="en-AU" w:eastAsia="zh-CN"/>
+              </w:rPr>
+            </w:pPr>
+            <w:r>
+              <w:rPr>
+                <w:rFonts w:ascii="Calibri" w:eastAsia="Times New Roman" w:hAnsi="Calibri" w:cs="Calibri"/>
+                <w:b/>
+                <w:bCs/>
+                <w:szCs w:val="22"/>
+                <w:lang w:val="en-AU" w:eastAsia="zh-CN"/>
+              </w:rPr>
+              <w:t>Username</w:t>
+            </w:r>
+          </w:p>
+        </w:tc>
+        <w:tc>
+          <w:tcPr>
+            <w:tcW w:w="1623" w:type="dxa"/>
+            <w:tcBorders>
+              <w:top w:val="single" w:sz="8" w:space="0" w:color="A3A3A3"/>
+              <w:left w:val="single" w:sz="8" w:space="0" w:color="A3A3A3"/>
+              <w:bottom w:val="single" w:sz="8" w:space="0" w:color="A3A3A3"/>
+              <w:right w:val="single" w:sz="8" w:space="0" w:color="A3A3A3"/>
+            </w:tcBorders>
+            <w:tcMar>
+              <w:top w:w="80" w:type="dxa"/>
+              <w:left w:w="80" w:type="dxa"/>
+              <w:bottom w:w="80" w:type="dxa"/>
+              <w:right w:w="80" w:type="dxa"/>
+            </w:tcMar>
+          </w:tcPr>
+          <w:p>
+            <w:pPr>
+              <w:spacing w:after="0" w:line="240" w:lineRule="auto"/>
+              <w:rPr>
+                <w:rFonts w:ascii="Calibri" w:eastAsia="Times New Roman" w:hAnsi="Calibri" w:cs="Calibri"/>
+                <w:b/>
+                <w:bCs/>
+                <w:szCs w:val="22"/>
+                <w:lang w:val="en-AU" w:eastAsia="zh-CN"/>
+              </w:rPr>
+            </w:pPr>
+            <w:r>
+              <w:rPr>
+                <w:rFonts w:ascii="Calibri" w:eastAsia="Times New Roman" w:hAnsi="Calibri" w:cs="Calibri"/>
+                <w:b/>
+                <w:bCs/>
+                <w:szCs w:val="22"/>
+                <w:lang w:val="en-AU" w:eastAsia="zh-CN"/>
+              </w:rPr>
+              <w:t>Email</w:t>
+            </w:r>
+          </w:p>
+        </w:tc>
+        <w:tc>
+          <w:tcPr>
+            <w:tcW w:w="1263" w:type="dxa"/>
+            <w:tcBorders>
+              <w:top w:val="single" w:sz="8" w:space="0" w:color="A3A3A3"/>
+              <w:left w:val="single" w:sz="8" w:space="0" w:color="A3A3A3"/>
+              <w:bottom w:val="single" w:sz="8" w:space="0" w:color="A3A3A3"/>
+              <w:right w:val="single" w:sz="8" w:space="0" w:color="A3A3A3"/>
+            </w:tcBorders>
+            <w:tcMar>
+              <w:top w:w="80" w:type="dxa"/>
+              <w:left w:w="80" w:type="dxa"/>
+              <w:bottom w:w="80" w:type="dxa"/>
+              <w:right w:w="80" w:type="dxa"/>
+            </w:tcMar>
+          </w:tcPr>
+          <w:p>
+            <w:pPr>
+              <w:spacing w:after="0" w:line="240" w:lineRule="auto"/>
+              <w:rPr>
+                <w:rFonts w:ascii="Calibri" w:eastAsia="Times New Roman" w:hAnsi="Calibri" w:cs="Calibri"/>
+                <w:b/>
+                <w:bCs/>
+                <w:szCs w:val="22"/>
+                <w:lang w:val="en-AU" w:eastAsia="zh-CN"/>
+              </w:rPr>
+            </w:pPr>
+            <w:r>
+              <w:rPr>
+                <w:rFonts w:ascii="Calibri" w:eastAsia="Times New Roman" w:hAnsi="Calibri" w:cs="Calibri"/>
+                <w:b/>
+                <w:bCs/>
+                <w:szCs w:val="22"/>
+                <w:lang w:val="en-AU" w:eastAsia="zh-CN"/>
+              </w:rPr>
+              <w:t>Password</w:t>
+            </w:r>
+          </w:p>
+        </w:tc>
+        <w:tc>
+          <w:tcPr>
+            <w:tcW w:w="1441" w:type="dxa"/>
+            <w:tcBorders>
+              <w:top w:val="single" w:sz="8" w:space="0" w:color="A3A3A3"/>
+              <w:left w:val="single" w:sz="8" w:space="0" w:color="A3A3A3"/>
+              <w:bottom w:val="single" w:sz="8" w:space="0" w:color="A3A3A3"/>
+              <w:right w:val="single" w:sz="8" w:space="0" w:color="A3A3A3"/>
+            </w:tcBorders>
+            <w:tcMar>
+              <w:top w:w="80" w:type="dxa"/>
+              <w:left w:w="80" w:type="dxa"/>
+              <w:bottom w:w="80" w:type="dxa"/>
+              <w:right w:w="80" w:type="dxa"/>
+            </w:tcMar>
+          </w:tcPr>
+          <w:p>
+            <w:pPr>
+              <w:spacing w:after="0" w:line="240" w:lineRule="auto"/>
+              <w:rPr>
+                <w:rFonts w:ascii="Calibri" w:eastAsia="Times New Roman" w:hAnsi="Calibri" w:cs="Calibri"/>
+                <w:b/>
+                <w:bCs/>
+                <w:szCs w:val="22"/>
+                <w:lang w:val="en-AU" w:eastAsia="zh-CN"/>
+              </w:rPr>
+            </w:pPr>
+            <w:r>
+              <w:rPr>
+                <w:rFonts w:ascii="Calibri" w:eastAsia="Times New Roman" w:hAnsi="Calibri" w:cs="Calibri"/>
+                <w:b/>
+                <w:bCs/>
+                <w:szCs w:val="22"/>
+                <w:lang w:val="en-AU" w:eastAsia="zh-CN"/>
+              </w:rPr>
+              <w:t>Role</w:t>
+            </w:r>
+          </w:p>
+        </w:tc>
+      </w:tr>
+      <w:tr>
+        <w:tc>
+          <w:tcPr>
+            <w:tcW w:w="1080" w:type="dxa"/>
+            <w:tcBorders>
+              <w:top w:val="single" w:sz="8" w:space="0" w:color="A3A3A3"/>
+              <w:left w:val="single" w:sz="8" w:space="0" w:color="A3A3A3"/>
+              <w:bottom w:val="single" w:sz="8" w:space="0" w:color="A3A3A3"/>
+              <w:right w:val="single" w:sz="8" w:space="0" w:color="A3A3A3"/>
+            </w:tcBorders>
+            <w:tcMar>
+              <w:top w:w="80" w:type="dxa"/>
+              <w:left w:w="80" w:type="dxa"/>
+              <w:bottom w:w="80" w:type="dxa"/>
+              <w:right w:w="80" w:type="dxa"/>
+            </w:tcMar>
+          </w:tcPr>
+          <w:p>
+            <w:pPr>
+              <w:spacing w:after="0" w:line="240" w:lineRule="auto"/>
+              <w:rPr>
+                <w:rFonts w:ascii="Calibri" w:eastAsia="Times New Roman" w:hAnsi="Calibri" w:cs="Calibri"/>
+                <w:szCs w:val="22"/>
+                <w:lang w:val="en-AU" w:eastAsia="zh-CN"/>
+              </w:rPr>
+            </w:pPr>
+            <w:r>
+              <w:rPr>
+                <w:rFonts w:ascii="Calibri" w:eastAsia="Times New Roman" w:hAnsi="Calibri" w:cs="Calibri"/>
+                <w:szCs w:val="22"/>
+                <w:lang w:val="en-AU" w:eastAsia="zh-CN"/>
+              </w:rPr>
+              <w:t>a</w:t>
+            </w:r>
+          </w:p>
+        </w:tc>
+        <w:tc>
+          <w:tcPr>
+            <w:tcW w:w="1623" w:type="dxa"/>
+            <w:tcBorders>
+              <w:top w:val="single" w:sz="8" w:space="0" w:color="A3A3A3"/>
+              <w:left w:val="single" w:sz="8" w:space="0" w:color="A3A3A3"/>
+              <w:bottom w:val="single" w:sz="8" w:space="0" w:color="A3A3A3"/>
+              <w:right w:val="single" w:sz="8" w:space="0" w:color="A3A3A3"/>
+            </w:tcBorders>
+            <w:tcMar>
+              <w:top w:w="80" w:type="dxa"/>
+              <w:left w:w="80" w:type="dxa"/>
+              <w:bottom w:w="80" w:type="dxa"/>
+              <w:right w:w="80" w:type="dxa"/>
+            </w:tcMar>
+          </w:tcPr>
+          <w:p>
+            <w:pPr>
+              <w:spacing w:after="0" w:line="240" w:lineRule="auto"/>
+              <w:rPr>
+                <w:rFonts w:ascii="Calibri" w:eastAsia="Times New Roman" w:hAnsi="Calibri" w:cs="Calibri"/>
+                <w:szCs w:val="22"/>
+                <w:lang w:val="en-AU" w:eastAsia="zh-CN"/>
+              </w:rPr>
+            </w:pPr>
+            <w:r>
+              <w:rPr>
+                <w:rFonts w:ascii="Calibri" w:eastAsia="Times New Roman" w:hAnsi="Calibri" w:cs="Calibri"/>
+                <w:szCs w:val="22"/>
+                <w:lang w:val="en-AU" w:eastAsia="zh-CN"/>
+              </w:rPr>
+              <w:t>a@a.com</w:t>
+            </w:r>
+          </w:p>
+        </w:tc>
+        <w:tc>
+          <w:tcPr>
+            <w:tcW w:w="1263" w:type="dxa"/>
+            <w:tcBorders>
+              <w:top w:val="single" w:sz="8" w:space="0" w:color="A3A3A3"/>
+              <w:left w:val="single" w:sz="8" w:space="0" w:color="A3A3A3"/>
+              <w:bottom w:val="single" w:sz="8" w:space="0" w:color="A3A3A3"/>
+              <w:right w:val="single" w:sz="8" w:space="0" w:color="A3A3A3"/>
+            </w:tcBorders>
+            <w:tcMar>
+              <w:top w:w="80" w:type="dxa"/>
+              <w:left w:w="80" w:type="dxa"/>
+              <w:bottom w:w="80" w:type="dxa"/>
+              <w:right w:w="80" w:type="dxa"/>
+            </w:tcMar>
+          </w:tcPr>
+          <w:p>
+            <w:pPr>
+              <w:spacing w:after="0" w:line="240" w:lineRule="auto"/>
+              <w:rPr>
+                <w:rFonts w:ascii="Calibri" w:eastAsia="Times New Roman" w:hAnsi="Calibri" w:cs="Calibri"/>
+                <w:szCs w:val="22"/>
+                <w:lang w:val="en-AU" w:eastAsia="zh-CN"/>
+              </w:rPr>
+            </w:pPr>
+            <w:r>
+              <w:rPr>
+                <w:rFonts w:ascii="Calibri" w:eastAsia="Times New Roman" w:hAnsi="Calibri" w:cs="Calibri"/>
+                <w:szCs w:val="22"/>
+                <w:lang w:val="en-AU" w:eastAsia="zh-CN"/>
+              </w:rPr>
+              <w:t>Zk000000!</w:t>
+            </w:r>
+          </w:p>
+        </w:tc>
+        <w:tc>
+          <w:tcPr>
+            <w:tcW w:w="1441" w:type="dxa"/>
+            <w:tcBorders>
+              <w:top w:val="single" w:sz="8" w:space="0" w:color="A3A3A3"/>
+              <w:left w:val="single" w:sz="8" w:space="0" w:color="A3A3A3"/>
+              <w:bottom w:val="single" w:sz="8" w:space="0" w:color="A3A3A3"/>
+              <w:right w:val="single" w:sz="8" w:space="0" w:color="A3A3A3"/>
+            </w:tcBorders>
+            <w:tcMar>
+              <w:top w:w="80" w:type="dxa"/>
+              <w:left w:w="80" w:type="dxa"/>
+              <w:bottom w:w="80" w:type="dxa"/>
+              <w:right w:w="80" w:type="dxa"/>
+            </w:tcMar>
+          </w:tcPr>
+          <w:p>
+            <w:pPr>
+              <w:spacing w:after="0" w:line="240" w:lineRule="auto"/>
+              <w:rPr>
+                <w:rFonts w:ascii="Calibri" w:eastAsia="Times New Roman" w:hAnsi="Calibri" w:cs="Calibri"/>
+                <w:szCs w:val="22"/>
+                <w:lang w:val="en-AU" w:eastAsia="zh-CN"/>
+              </w:rPr>
+            </w:pPr>
+            <w:r>
+              <w:rPr>
+                <w:rFonts w:ascii="Calibri" w:eastAsia="Times New Roman" w:hAnsi="Calibri" w:cs="Calibri"/>
+                <w:szCs w:val="22"/>
+                <w:lang w:val="en-AU" w:eastAsia="zh-CN"/>
+              </w:rPr>
+              <w:t>User</w:t>
+            </w:r>
+          </w:p>
+        </w:tc>
+      </w:tr>
+      <w:tr>
+        <w:tc>
+          <w:tcPr>
+            <w:tcW w:w="1080" w:type="dxa"/>
+            <w:tcBorders>
+              <w:top w:val="single" w:sz="8" w:space="0" w:color="A3A3A3"/>
+              <w:left w:val="single" w:sz="8" w:space="0" w:color="A3A3A3"/>
+              <w:bottom w:val="single" w:sz="8" w:space="0" w:color="A3A3A3"/>
+              <w:right w:val="single" w:sz="8" w:space="0" w:color="A3A3A3"/>
+            </w:tcBorders>
+            <w:tcMar>
+              <w:top w:w="80" w:type="dxa"/>
+              <w:left w:w="80" w:type="dxa"/>
+              <w:bottom w:w="80" w:type="dxa"/>
+              <w:right w:w="80" w:type="dxa"/>
+            </w:tcMar>
+          </w:tcPr>
+          <w:p>
+            <w:pPr>
+              <w:spacing w:after="0" w:line="240" w:lineRule="auto"/>
+              <w:rPr>
+                <w:rFonts w:ascii="Calibri" w:eastAsia="Times New Roman" w:hAnsi="Calibri" w:cs="Calibri"/>
+                <w:szCs w:val="22"/>
+                <w:lang w:val="en-AU" w:eastAsia="zh-CN"/>
+              </w:rPr>
+            </w:pPr>
+            <w:r>
+              <w:rPr>
+                <w:rFonts w:ascii="Calibri" w:eastAsia="Times New Roman" w:hAnsi="Calibri" w:cs="Calibri"/>
+                <w:szCs w:val="22"/>
+                <w:lang w:val="en-AU" w:eastAsia="zh-CN"/>
+              </w:rPr>
+              <w:t>admin</w:t>
+            </w:r>
+          </w:p>
+        </w:tc>
+        <w:tc>
+          <w:tcPr>
+            <w:tcW w:w="1623" w:type="dxa"/>
+            <w:tcBorders>
+              <w:top w:val="single" w:sz="8" w:space="0" w:color="A3A3A3"/>
+              <w:left w:val="single" w:sz="8" w:space="0" w:color="A3A3A3"/>
+              <w:bottom w:val="single" w:sz="8" w:space="0" w:color="A3A3A3"/>
+              <w:right w:val="single" w:sz="8" w:space="0" w:color="A3A3A3"/>
+            </w:tcBorders>
+            <w:tcMar>
+              <w:top w:w="80" w:type="dxa"/>
+              <w:left w:w="80" w:type="dxa"/>
+              <w:bottom w:w="80" w:type="dxa"/>
+              <w:right w:w="80" w:type="dxa"/>
+            </w:tcMar>
+          </w:tcPr>
+          <w:p>
+            <w:pPr>
+              <w:spacing w:after="0" w:line="240" w:lineRule="auto"/>
+              <w:rPr>
+                <w:rFonts w:ascii="Calibri" w:eastAsia="Times New Roman" w:hAnsi="Calibri" w:cs="Calibri"/>
+                <w:szCs w:val="22"/>
+                <w:lang w:val="en-AU" w:eastAsia="zh-CN"/>
+              </w:rPr>
+            </w:pPr>
+            <w:r>
+              <w:rPr>
+                <w:rFonts w:ascii="Calibri" w:eastAsia="Times New Roman" w:hAnsi="Calibri" w:cs="Calibri"/>
+                <w:szCs w:val="22"/>
+                <w:lang w:val="en-AU" w:eastAsia="zh-CN"/>
+              </w:rPr>
+              <w:t>admin@a.com</w:t>
+            </w:r>
+          </w:p>
+        </w:tc>
+        <w:tc>
+          <w:tcPr>
+            <w:tcW w:w="1263" w:type="dxa"/>
+            <w:tcBorders>
+              <w:top w:val="single" w:sz="8" w:space="0" w:color="A3A3A3"/>
+              <w:left w:val="single" w:sz="8" w:space="0" w:color="A3A3A3"/>
+              <w:bottom w:val="single" w:sz="8" w:space="0" w:color="A3A3A3"/>
+              <w:right w:val="single" w:sz="8" w:space="0" w:color="A3A3A3"/>
+            </w:tcBorders>
+            <w:tcMar>
+              <w:top w:w="80" w:type="dxa"/>
+              <w:left w:w="80" w:type="dxa"/>
+              <w:bottom w:w="80" w:type="dxa"/>
+              <w:right w:w="80" w:type="dxa"/>
+            </w:tcMar>
+          </w:tcPr>
+          <w:p>
+            <w:pPr>
+              <w:spacing w:after="0" w:line="240" w:lineRule="auto"/>
+              <w:rPr>
+                <w:rFonts w:ascii="Calibri" w:eastAsia="Times New Roman" w:hAnsi="Calibri" w:cs="Calibri"/>
+                <w:szCs w:val="22"/>
+                <w:lang w:val="en-AU" w:eastAsia="zh-CN"/>
+              </w:rPr>
+            </w:pPr>
+            <w:r>
+              <w:rPr>
+                <w:rFonts w:ascii="Calibri" w:eastAsia="Times New Roman" w:hAnsi="Calibri" w:cs="Calibri"/>
+                <w:szCs w:val="22"/>
+                <w:lang w:val="en-AU" w:eastAsia="zh-CN"/>
+              </w:rPr>
+              <w:t>Zk000000!</w:t>
+            </w:r>
+          </w:p>
+        </w:tc>
+        <w:tc>
+          <w:tcPr>
+            <w:tcW w:w="1441" w:type="dxa"/>
+            <w:tcBorders>
+              <w:top w:val="single" w:sz="8" w:space="0" w:color="A3A3A3"/>
+              <w:left w:val="single" w:sz="8" w:space="0" w:color="A3A3A3"/>
+              <w:bottom w:val="single" w:sz="8" w:space="0" w:color="A3A3A3"/>
+              <w:right w:val="single" w:sz="8" w:space="0" w:color="A3A3A3"/>
+            </w:tcBorders>
+            <w:tcMar>
+              <w:top w:w="80" w:type="dxa"/>
+              <w:left w:w="80" w:type="dxa"/>
+              <w:bottom w:w="80" w:type="dxa"/>
+              <w:right w:w="80" w:type="dxa"/>
+            </w:tcMar>
+          </w:tcPr>
+          <w:p>
+            <w:pPr>
+              <w:spacing w:after="0" w:line="240" w:lineRule="auto"/>
+              <w:rPr>
+                <w:rFonts w:ascii="Calibri" w:eastAsia="Times New Roman" w:hAnsi="Calibri" w:cs="Calibri"/>
+                <w:szCs w:val="22"/>
+                <w:lang w:val="en-AU" w:eastAsia="zh-CN"/>
+              </w:rPr>
+            </w:pPr>
+            <w:r>
+              <w:rPr>
+                <w:rFonts w:ascii="Calibri" w:eastAsia="Times New Roman" w:hAnsi="Calibri" w:cs="Calibri"/>
+                <w:szCs w:val="22"/>
+                <w:lang w:val="en-AU" w:eastAsia="zh-CN"/>
+              </w:rPr>
+              <w:t>Administrator</w:t>
+            </w:r>
+          </w:p>
+        </w:tc>
+      </w:tr>
+    </w:tbl>
+    <w:bookmarkEnd w:id="3"/>
+    <w:p>
+      <w:pPr>
+        <w:pStyle w:val="3"/>
+      </w:pPr>
+      <w:r>
+        <w:t>Secrets</w:t>
+      </w:r>
+    </w:p>
+    <w:p>
+      <w:pPr>
+        <w:pStyle w:val="aff5"/>
+        <w:spacing w:before="0" w:beforeAutospacing="0" w:after="0" w:afterAutospacing="0"/>
+        <w:rPr>
+          <w:rFonts w:asciiTheme="majorHAnsi" w:hAnsiTheme="majorHAnsi" w:cstheme="majorHAnsi"/>
+          <w:sz w:val="22"/>
+          <w:szCs w:val="22"/>
+        </w:rPr>
+      </w:pPr>
+      <w:r>
+        <w:rPr>
+          <w:rFonts w:asciiTheme="majorHAnsi" w:hAnsiTheme="majorHAnsi" w:cstheme="majorHAnsi"/>
+          <w:sz w:val="22"/>
+          <w:szCs w:val="22"/>
+        </w:rPr>
+        <w:t>Secrets need to be stored in</w:t>
+      </w:r>
+    </w:p>
+    <w:p>
+      <w:pPr>
+        <w:pStyle w:val="afd"/>
+        <w:numPr>
+          <w:ilvl w:val="0"/>
+          <w:numId w:val="16"/>
+        </w:numPr>
+        <w:spacing w:after="0" w:line="240" w:lineRule="auto"/>
+        <w:textAlignment w:val="center"/>
+        <w:rPr>
+          <w:rFonts w:cstheme="majorHAnsi"/>
+          <w:szCs w:val="22"/>
+        </w:rPr>
+      </w:pPr>
+      <w:proofErr w:type="spellStart"/>
+      <w:r>
+        <w:rPr>
+          <w:rFonts w:cstheme="majorHAnsi"/>
+          <w:szCs w:val="22"/>
+        </w:rPr>
+        <w:t>MyShop</w:t>
+      </w:r>
+      <w:proofErr w:type="spellEnd"/>
+      <w:r>
+        <w:rPr>
+          <w:rFonts w:cstheme="majorHAnsi"/>
+          <w:szCs w:val="22"/>
+        </w:rPr>
+        <w:t>/</w:t>
+      </w:r>
+      <w:proofErr w:type="spellStart"/>
+      <w:r>
+        <w:rPr>
+          <w:rFonts w:cstheme="majorHAnsi"/>
+          <w:szCs w:val="22"/>
+        </w:rPr>
+        <w:t>appSettings.Development.json</w:t>
+      </w:r>
+      <w:proofErr w:type="spellEnd"/>
+    </w:p>
+    <w:p>
+      <w:pPr>
+        <w:pStyle w:val="afd"/>
+        <w:numPr>
+          <w:ilvl w:val="0"/>
+          <w:numId w:val="16"/>
+        </w:numPr>
+        <w:spacing w:after="0" w:line="240" w:lineRule="auto"/>
+        <w:textAlignment w:val="center"/>
+        <w:rPr>
+          <w:rFonts w:cstheme="majorHAnsi"/>
+          <w:szCs w:val="22"/>
+        </w:rPr>
+      </w:pPr>
+      <w:r>
+        <w:rPr>
+          <w:rFonts w:cstheme="majorHAnsi"/>
+          <w:szCs w:val="22"/>
+        </w:rPr>
+        <w:t>client</w:t>
+      </w:r>
+      <w:proofErr w:type="gramStart"/>
+      <w:r>
+        <w:rPr>
+          <w:rFonts w:cstheme="majorHAnsi"/>
+          <w:szCs w:val="22"/>
+        </w:rPr>
+        <w:t>/.</w:t>
+      </w:r>
+      <w:proofErr w:type="spellStart"/>
+      <w:r>
+        <w:rPr>
+          <w:rFonts w:cstheme="majorHAnsi"/>
+          <w:szCs w:val="22"/>
+        </w:rPr>
+        <w:t>env</w:t>
+      </w:r>
+      <w:proofErr w:type="gramEnd"/>
+      <w:r>
+        <w:rPr>
+          <w:rFonts w:cstheme="majorHAnsi"/>
+          <w:szCs w:val="22"/>
+        </w:rPr>
+        <w:t>.development</w:t>
+      </w:r>
+      <w:proofErr w:type="spellEnd"/>
+    </w:p>
+    <w:p>
+      <w:pPr>
+        <w:pStyle w:val="aff5"/>
+        <w:spacing w:before="0" w:beforeAutospacing="0" w:after="0" w:afterAutospacing="0"/>
+        <w:rPr>
+          <w:rFonts w:asciiTheme="majorHAnsi" w:hAnsiTheme="majorHAnsi" w:cstheme="majorHAnsi"/>
+          <w:sz w:val="22"/>
+          <w:szCs w:val="22"/>
+          <w:lang w:val="en-US"/>
+        </w:rPr>
+      </w:pPr>
+      <w:r>
+        <w:rPr>
+          <w:rFonts w:asciiTheme="majorHAnsi" w:hAnsiTheme="majorHAnsi" w:cstheme="majorHAnsi"/>
+          <w:sz w:val="22"/>
+          <w:szCs w:val="22"/>
+          <w:lang w:val="en-US"/>
+        </w:rPr>
+        <w:t>Required secrets:</w:t>
+      </w:r>
+    </w:p>
+    <w:p>
+      <w:pPr>
+        <w:pStyle w:val="afd"/>
+        <w:numPr>
+          <w:ilvl w:val="0"/>
+          <w:numId w:val="18"/>
+        </w:numPr>
+        <w:spacing w:after="0" w:line="240" w:lineRule="auto"/>
+        <w:textAlignment w:val="center"/>
+        <w:rPr>
+          <w:rFonts w:cstheme="majorHAnsi"/>
+          <w:szCs w:val="22"/>
+          <w:lang w:val="en-AU"/>
+        </w:rPr>
+      </w:pPr>
+      <w:proofErr w:type="spellStart"/>
+      <w:r>
+        <w:rPr>
+          <w:rFonts w:cstheme="majorHAnsi"/>
+          <w:szCs w:val="22"/>
+        </w:rPr>
+        <w:t>ConnectionStrings</w:t>
+      </w:r>
+      <w:proofErr w:type="spellEnd"/>
+      <w:r>
+        <w:rPr>
+          <w:rFonts w:cstheme="majorHAnsi"/>
+          <w:szCs w:val="22"/>
+        </w:rPr>
+        <w:t xml:space="preserve"> - </w:t>
+      </w:r>
+      <w:proofErr w:type="spellStart"/>
+      <w:proofErr w:type="gramStart"/>
+      <w:r>
+        <w:rPr>
+          <w:rFonts w:cstheme="majorHAnsi"/>
+          <w:szCs w:val="22"/>
+        </w:rPr>
+        <w:t>DefaultConnection</w:t>
+      </w:r>
+      <w:proofErr w:type="spellEnd"/>
+      <w:r>
+        <w:rPr>
+          <w:rFonts w:cstheme="majorHAnsi"/>
+          <w:szCs w:val="22"/>
+        </w:rPr>
+        <w:t xml:space="preserve"> :</w:t>
+      </w:r>
+      <w:proofErr w:type="gramEnd"/>
+      <w:r>
+        <w:rPr>
+          <w:rFonts w:cstheme="majorHAnsi"/>
+          <w:szCs w:val="22"/>
+        </w:rPr>
+        <w:t xml:space="preserve"> the database connection string</w:t>
+      </w:r>
+    </w:p>
+    <w:p>
+      <w:pPr>
+        <w:pStyle w:val="afd"/>
+        <w:numPr>
+          <w:ilvl w:val="0"/>
+          <w:numId w:val="18"/>
+        </w:numPr>
+        <w:spacing w:after="0" w:line="240" w:lineRule="auto"/>
+        <w:textAlignment w:val="center"/>
+        <w:rPr>
+          <w:rFonts w:cstheme="majorHAnsi"/>
+          <w:szCs w:val="22"/>
+        </w:rPr>
+      </w:pPr>
+      <w:bookmarkStart w:id="4" w:name="_Hlk151740111"/>
+      <w:proofErr w:type="spellStart"/>
+      <w:r>
+        <w:rPr>
+          <w:rFonts w:cstheme="majorHAnsi"/>
+          <w:szCs w:val="22"/>
+        </w:rPr>
+        <w:t>JWTSettings</w:t>
+      </w:r>
+      <w:proofErr w:type="spellEnd"/>
+      <w:r>
+        <w:rPr>
+          <w:rFonts w:cstheme="majorHAnsi"/>
+          <w:szCs w:val="22"/>
+        </w:rPr>
+        <w:t xml:space="preserve"> - </w:t>
+      </w:r>
+      <w:proofErr w:type="spellStart"/>
+      <w:r>
+        <w:rPr>
+          <w:rFonts w:cstheme="majorHAnsi"/>
+          <w:szCs w:val="22"/>
+        </w:rPr>
+        <w:t>TokenKey</w:t>
+      </w:r>
+      <w:bookmarkEnd w:id="4"/>
+      <w:proofErr w:type="spellEnd"/>
+      <w:r>
+        <w:rPr>
+          <w:rFonts w:cstheme="majorHAnsi"/>
+          <w:szCs w:val="22"/>
+        </w:rPr>
+        <w:t xml:space="preserve">: can be any random </w:t>
+      </w:r>
+      <w:proofErr w:type="gramStart"/>
+      <w:r>
+        <w:rPr>
+          <w:rFonts w:cstheme="majorHAnsi"/>
+          <w:szCs w:val="22"/>
+        </w:rPr>
+        <w:t>key</w:t>
+      </w:r>
+      <w:proofErr w:type="gramEnd"/>
+    </w:p>
+    <w:p>
+      <w:pPr>
+        <w:pStyle w:val="afd"/>
+        <w:numPr>
+          <w:ilvl w:val="0"/>
+          <w:numId w:val="18"/>
+        </w:numPr>
+        <w:spacing w:after="0" w:line="240" w:lineRule="auto"/>
+        <w:textAlignment w:val="center"/>
+        <w:rPr>
+          <w:rFonts w:cstheme="majorHAnsi"/>
+          <w:szCs w:val="22"/>
+        </w:rPr>
+      </w:pPr>
+      <w:proofErr w:type="spellStart"/>
+      <w:r>
+        <w:rPr>
+          <w:rFonts w:cstheme="majorHAnsi"/>
+          <w:szCs w:val="22"/>
+        </w:rPr>
+        <w:t>StripeSettings</w:t>
+      </w:r>
+      <w:proofErr w:type="spellEnd"/>
+    </w:p>
+    <w:p>
+      <w:pPr>
+        <w:numPr>
+          <w:ilvl w:val="1"/>
+          <w:numId w:val="19"/>
+        </w:numPr>
+        <w:spacing w:after="0" w:line="240" w:lineRule="auto"/>
+        <w:textAlignment w:val="center"/>
+        <w:rPr>
+          <w:rFonts w:cstheme="majorHAnsi"/>
+          <w:szCs w:val="22"/>
+        </w:rPr>
+      </w:pPr>
+      <w:r>
+        <w:rPr>
+          <w:rFonts w:cstheme="majorHAnsi"/>
+          <w:szCs w:val="22"/>
+        </w:rPr>
+        <w:t xml:space="preserve">Public key and secret key can be found in </w:t>
+      </w:r>
+      <w:r>
+        <w:rPr>
+          <w:rFonts w:cstheme="majorHAnsi"/>
+          <w:i/>
+          <w:iCs/>
+          <w:szCs w:val="22"/>
+        </w:rPr>
+        <w:t>Developer - API Keys</w:t>
+      </w:r>
+    </w:p>
+    <w:p>
+      <w:pPr>
+        <w:numPr>
+          <w:ilvl w:val="1"/>
+          <w:numId w:val="19"/>
+        </w:numPr>
+        <w:spacing w:after="0" w:line="240" w:lineRule="auto"/>
+        <w:textAlignment w:val="center"/>
+        <w:rPr>
+          <w:rFonts w:cstheme="majorHAnsi"/>
+          <w:szCs w:val="22"/>
+          <w:lang w:val="en-AU"/>
+        </w:rPr>
+      </w:pPr>
+      <w:r>
+        <w:rPr>
+          <w:rFonts w:cstheme="majorHAnsi"/>
+          <w:szCs w:val="22"/>
+        </w:rPr>
+        <w:t>Add a new endpoint in Developer - Webhook with the URL suffix /</w:t>
+      </w:r>
+      <w:proofErr w:type="spellStart"/>
+      <w:r>
+        <w:rPr>
+          <w:rFonts w:cstheme="majorHAnsi"/>
+          <w:szCs w:val="22"/>
+        </w:rPr>
+        <w:t>api</w:t>
+      </w:r>
+      <w:proofErr w:type="spellEnd"/>
+      <w:r>
+        <w:rPr>
+          <w:rFonts w:cstheme="majorHAnsi"/>
+          <w:szCs w:val="22"/>
+        </w:rPr>
+        <w:t>/payments/webhook. The signing key of the newly added endpoint serves as the webhook secret.</w:t>
+      </w:r>
+    </w:p>
+    <w:p>
+      <w:pPr>
+        <w:numPr>
+          <w:ilvl w:val="0"/>
+          <w:numId w:val="15"/>
+        </w:numPr>
+        <w:spacing w:after="0" w:line="240" w:lineRule="auto"/>
+        <w:textAlignment w:val="center"/>
+        <w:rPr>
+          <w:rFonts w:cstheme="majorHAnsi"/>
+          <w:szCs w:val="22"/>
+        </w:rPr>
+      </w:pPr>
+      <w:proofErr w:type="spellStart"/>
+      <w:r>
+        <w:rPr>
+          <w:rFonts w:cstheme="majorHAnsi"/>
+          <w:szCs w:val="22"/>
+        </w:rPr>
+        <w:t>CloudinarySettings</w:t>
+      </w:r>
+      <w:proofErr w:type="spellEnd"/>
+    </w:p>
+    <w:p>
+      <w:pPr>
+        <w:numPr>
+          <w:ilvl w:val="1"/>
+          <w:numId w:val="15"/>
+        </w:numPr>
+        <w:spacing w:after="0" w:line="240" w:lineRule="auto"/>
+        <w:textAlignment w:val="center"/>
+        <w:rPr>
+          <w:rFonts w:cstheme="majorHAnsi"/>
+          <w:szCs w:val="22"/>
+        </w:rPr>
+      </w:pPr>
+      <w:r>
+        <w:rPr>
+          <w:rFonts w:cstheme="majorHAnsi"/>
+          <w:szCs w:val="22"/>
+        </w:rPr>
+        <w:t xml:space="preserve">Login with </w:t>
+      </w:r>
+      <w:proofErr w:type="spellStart"/>
+      <w:r>
+        <w:rPr>
+          <w:rFonts w:cstheme="majorHAnsi"/>
+          <w:szCs w:val="22"/>
+        </w:rPr>
+        <w:t>Github</w:t>
+      </w:r>
+      <w:proofErr w:type="spellEnd"/>
+      <w:r>
+        <w:rPr>
+          <w:rFonts w:cstheme="majorHAnsi"/>
+          <w:szCs w:val="22"/>
+        </w:rPr>
+        <w:t xml:space="preserve">. In Dashboard, find </w:t>
+      </w:r>
+      <w:proofErr w:type="spellStart"/>
+      <w:r>
+        <w:rPr>
+          <w:rFonts w:cstheme="majorHAnsi"/>
+          <w:szCs w:val="22"/>
+        </w:rPr>
+        <w:t>Cloudname</w:t>
+      </w:r>
+      <w:proofErr w:type="spellEnd"/>
+      <w:r>
+        <w:rPr>
+          <w:rFonts w:cstheme="majorHAnsi"/>
+          <w:szCs w:val="22"/>
+        </w:rPr>
+        <w:t xml:space="preserve">, </w:t>
+      </w:r>
+      <w:proofErr w:type="spellStart"/>
+      <w:r>
+        <w:rPr>
+          <w:rFonts w:cstheme="majorHAnsi"/>
+          <w:szCs w:val="22"/>
+        </w:rPr>
+        <w:t>ApiKey</w:t>
+      </w:r>
+      <w:proofErr w:type="spellEnd"/>
+      <w:r>
+        <w:rPr>
+          <w:rFonts w:cstheme="majorHAnsi"/>
+          <w:szCs w:val="22"/>
+        </w:rPr>
+        <w:t xml:space="preserve">, </w:t>
+      </w:r>
+      <w:proofErr w:type="spellStart"/>
+      <w:r>
+        <w:rPr>
+          <w:rFonts w:cstheme="majorHAnsi"/>
+          <w:szCs w:val="22"/>
+        </w:rPr>
+        <w:t>ApiSecrets</w:t>
+      </w:r>
+      <w:proofErr w:type="spellEnd"/>
+      <w:r>
+        <w:rPr>
+          <w:rFonts w:cstheme="majorHAnsi"/>
+          <w:szCs w:val="22"/>
+        </w:rPr>
+        <w:t>.</w:t>
+      </w:r>
+      <w:bookmarkEnd w:id="2"/>
+    </w:p>
+    <w:p>
+      <w:pPr>
+        <w:pStyle w:val="3"/>
+        <w:rPr>
+          <w:lang w:val="en-AU"/>
+        </w:rPr>
+      </w:pPr>
+      <w:r>
+        <w:rPr>
+          <w:lang w:val="en-AU"/>
+        </w:rPr>
+        <w:t>Stripe Testing Card</w:t>
+      </w:r>
+    </w:p>
+    <w:p>
+      <w:pPr>
+        <w:rPr>
+          <w:rFonts w:cstheme="majorHAnsi"/>
+          <w:szCs w:val="22"/>
+          <w:lang w:val="en-AU"/>
+        </w:rPr>
+      </w:pPr>
+      <w:r>
+        <w:rPr>
+          <w:rFonts w:cstheme="majorHAnsi"/>
+          <w:szCs w:val="22"/>
+          <w:lang w:val="en-AU"/>
+        </w:rPr>
+        <w:t>Use the Stripe testing card to make a payment. The payment card has the following details.</w:t>
+      </w:r>
+    </w:p>
+    <w:p>
+      <w:pPr>
+        <w:pStyle w:val="af3"/>
+        <w:numPr>
+          <w:ilvl w:val="0"/>
+          <w:numId w:val="8"/>
+        </w:numPr>
+        <w:rPr>
+          <w:rFonts w:asciiTheme="majorHAnsi" w:hAnsiTheme="majorHAnsi" w:cstheme="majorHAnsi"/>
+          <w:sz w:val="22"/>
+          <w:szCs w:val="22"/>
+          <w:lang w:val="en-AU"/>
+        </w:rPr>
+      </w:pPr>
+      <w:r>
+        <w:rPr>
+          <w:rFonts w:asciiTheme="majorHAnsi" w:hAnsiTheme="majorHAnsi" w:cstheme="majorHAnsi"/>
+          <w:sz w:val="22"/>
+          <w:szCs w:val="22"/>
+          <w:lang w:val="en-AU"/>
+        </w:rPr>
+        <w:t>Card No. 4242 4242 4242 4242</w:t>
+      </w:r>
+    </w:p>
+    <w:p>
+      <w:pPr>
+        <w:pStyle w:val="af3"/>
+        <w:numPr>
+          <w:ilvl w:val="0"/>
+          <w:numId w:val="8"/>
+        </w:numPr>
+        <w:rPr>
+          <w:rFonts w:asciiTheme="majorHAnsi" w:hAnsiTheme="majorHAnsi" w:cstheme="majorHAnsi"/>
+          <w:sz w:val="22"/>
+          <w:szCs w:val="22"/>
+          <w:lang w:val="en-AU"/>
+        </w:rPr>
+      </w:pPr>
+      <w:r>
+        <w:rPr>
+          <w:rFonts w:asciiTheme="majorHAnsi" w:hAnsiTheme="majorHAnsi" w:cstheme="majorHAnsi"/>
+          <w:sz w:val="22"/>
+          <w:szCs w:val="22"/>
+          <w:lang w:val="en-AU"/>
+        </w:rPr>
+        <w:t>Name, Date and CVC can have any value.</w:t>
+      </w:r>
+    </w:p>
+    <w:p>
+      <w:pPr>
+        <w:rPr>
           <w:rFonts w:ascii="Segoe UI" w:hAnsi="Segoe UI" w:cs="Segoe UI"/>
           <w:color w:val="0F0F0F"/>
         </w:rPr>
       </w:pPr>
-      <w:bookmarkStart w:id="1" w:name="_Hlk151022356"/>
-      <w:r>
-        <w:rPr>
-          <w:rFonts w:ascii="Segoe UI" w:hAnsi="Segoe UI" w:cs="Segoe UI"/>
-          <w:color w:val="0F0F0F"/>
-        </w:rPr>
-        <w:t>This repository contains the source code for my e-commerce website</w:t>
-      </w:r>
-      <w:bookmarkEnd w:id="1"/>
-      <w:r>
-        <w:rPr>
-          <w:rFonts w:ascii="Segoe UI" w:hAnsi="Segoe UI" w:cs="Segoe UI"/>
-          <w:color w:val="0F0F0F"/>
-        </w:rPr>
-        <w:t>, using ASP.NET Core as backend and React.js as front end.</w:t>
-      </w:r>
     </w:p>
-    <w:p/>
     <w:p>
       <w:pPr>
         <w:pStyle w:val="2"/>
       </w:pPr>
-      <w:r>
-        <w:rPr>
-          <w:rFonts w:hint="eastAsia"/>
-          <w:lang w:eastAsia="zh-CN"/>
-        </w:rPr>
-        <w:t>Description</w:t>
+      <w:bookmarkStart w:id="5" w:name="_Hlk151740155"/>
+      <w:r>
+        <w:t>Features</w:t>
+      </w:r>
+    </w:p>
+    <w:bookmarkEnd w:id="5"/>
+    <w:p>
+      <w:r>
+        <w:t xml:space="preserve">Users can search </w:t>
+      </w:r>
+      <w:r>
+        <w:t xml:space="preserve">for </w:t>
+      </w:r>
+      <w:r>
+        <w:t>a product, sort and filter products.</w:t>
+      </w:r>
+    </w:p>
+    <w:p>
+      <w:pPr>
+        <w:jc w:val="center"/>
+      </w:pPr>
+      <w:r>
+        <w:rPr>
+          <w:noProof/>
+        </w:rPr>
+        <w:lastRenderedPageBreak/>
+        <w:drawing>
+          <wp:inline distT="0" distB="0" distL="0" distR="0" wp14:anchorId="40CD7153" wp14:editId="24815E7C">
+            <wp:extent cx="6109014" cy="2629035"/>
+            <wp:effectExtent l="0" t="0" r="6350" b="0"/>
+            <wp:docPr id="1686034051" name="图片 1"/>
+            <wp:cNvGraphicFramePr>
+              <a:graphicFrameLocks xmlns:a="http://schemas.openxmlformats.org/drawingml/2006/main" noChangeAspect="1"/>
+            </wp:cNvGraphicFramePr>
+            <a:graphic xmlns:a="http://schemas.openxmlformats.org/drawingml/2006/main">
+              <a:graphicData uri="http://schemas.openxmlformats.org/drawingml/2006/picture">
+                <pic:pic xmlns:pic="http://schemas.openxmlformats.org/drawingml/2006/picture">
+                  <pic:nvPicPr>
+                    <pic:cNvPr id="1686034051" name=""/>
+                    <pic:cNvPicPr/>
+                  </pic:nvPicPr>
+                  <pic:blipFill>
+                    <a:blip r:embed="rId9"/>
+                    <a:stretch>
+                      <a:fillRect/>
+                    </a:stretch>
+                  </pic:blipFill>
+                  <pic:spPr>
+                    <a:xfrm>
+                      <a:off x="0" y="0"/>
+                      <a:ext cx="6109014" cy="2629035"/>
+                    </a:xfrm>
+                    <a:prstGeom prst="rect">
+                      <a:avLst/>
+                    </a:prstGeom>
+                  </pic:spPr>
+                </pic:pic>
+              </a:graphicData>
+            </a:graphic>
+          </wp:inline>
+        </w:drawing>
+      </w:r>
+    </w:p>
+    <w:p>
+      <w:r>
+        <w:rPr>
+          <w:lang w:val="en-AU"/>
+        </w:rPr>
+        <w:t>An administrator user gains access to Inventory page where he can create or update products.</w:t>
+      </w:r>
+    </w:p>
+    <w:p>
+      <w:pPr>
+        <w:jc w:val="center"/>
+        <w:rPr>
+          <w:lang w:val="en-AU"/>
+        </w:rPr>
+      </w:pPr>
+      <w:r>
+        <w:rPr>
+          <w:noProof/>
+          <w:lang w:val="en-AU"/>
+        </w:rPr>
+        <w:drawing>
+          <wp:inline distT="0" distB="0" distL="0" distR="0" wp14:anchorId="41FA4232" wp14:editId="5D738825">
+            <wp:extent cx="6175093" cy="2089607"/>
+            <wp:effectExtent l="0" t="0" r="0" b="0"/>
+            <wp:docPr id="602115934" name="图片 1"/>
+            <wp:cNvGraphicFramePr>
+              <a:graphicFrameLocks xmlns:a="http://schemas.openxmlformats.org/drawingml/2006/main" noChangeAspect="1"/>
+            </wp:cNvGraphicFramePr>
+            <a:graphic xmlns:a="http://schemas.openxmlformats.org/drawingml/2006/main">
+              <a:graphicData uri="http://schemas.openxmlformats.org/drawingml/2006/picture">
+                <pic:pic xmlns:pic="http://schemas.openxmlformats.org/drawingml/2006/picture">
+                  <pic:nvPicPr>
+                    <pic:cNvPr id="602115934" name=""/>
+                    <pic:cNvPicPr/>
+                  </pic:nvPicPr>
+                  <pic:blipFill>
+                    <a:blip r:embed="rId10"/>
+                    <a:stretch>
+                      <a:fillRect/>
+                    </a:stretch>
+                  </pic:blipFill>
+                  <pic:spPr>
+                    <a:xfrm>
+                      <a:off x="0" y="0"/>
+                      <a:ext cx="6181315" cy="2091712"/>
+                    </a:xfrm>
+                    <a:prstGeom prst="rect">
+                      <a:avLst/>
+                    </a:prstGeom>
+                  </pic:spPr>
+                </pic:pic>
+              </a:graphicData>
+            </a:graphic>
+          </wp:inline>
+        </w:drawing>
       </w:r>
     </w:p>
     <w:bookmarkEnd w:id="0"/>
     <w:p>
       <w:pPr>
         <w:rPr>
-          <w:lang w:val="en-AU"/>
-        </w:rPr>
-      </w:pPr>
+          <w:rFonts w:ascii="Calibri" w:hAnsi="Calibri" w:cs="Calibri"/>
+          <w:szCs w:val="22"/>
+        </w:rPr>
+      </w:pPr>
+      <w:r>
+        <w:rPr>
+          <w:rFonts w:ascii="Calibri" w:hAnsi="Calibri" w:cs="Calibri"/>
+          <w:szCs w:val="22"/>
+        </w:rPr>
+        <w:t xml:space="preserve">When a non-logged-in user adds items to the basket, the server assigns a </w:t>
+      </w:r>
+      <w:proofErr w:type="spellStart"/>
+      <w:r>
+        <w:rPr>
+          <w:rFonts w:ascii="Calibri" w:hAnsi="Calibri" w:cs="Calibri"/>
+          <w:szCs w:val="22"/>
+        </w:rPr>
+        <w:t>buyerId</w:t>
+      </w:r>
+      <w:proofErr w:type="spellEnd"/>
+      <w:r>
+        <w:rPr>
+          <w:rFonts w:ascii="Calibri" w:hAnsi="Calibri" w:cs="Calibri"/>
+          <w:szCs w:val="22"/>
+        </w:rPr>
+        <w:t xml:space="preserve"> and stores it in a cookie. Upon returning to the web app, the user retains their basket items. During checkout, the app prompts the user to log in or register.</w:t>
+      </w:r>
     </w:p>
     <w:p>
       <w:pPr>
         <w:rPr>
-          <w:lang w:val="en-AU"/>
-        </w:rPr>
-      </w:pPr>
+          <w:rFonts w:ascii="Calibri" w:hAnsi="Calibri" w:cs="Calibri"/>
+          <w:szCs w:val="22"/>
+        </w:rPr>
+      </w:pPr>
+      <w:r>
+        <w:rPr>
+          <w:rFonts w:ascii="Calibri" w:hAnsi="Calibri" w:cs="Calibri"/>
+          <w:szCs w:val="22"/>
+        </w:rPr>
+        <w:t>Users can modify their baskets before checking out.</w:t>
+      </w:r>
     </w:p>
     <w:p>
       <w:pPr>
         <w:rPr>
-          <w:lang w:val="en-AU"/>
-        </w:rPr>
-      </w:pPr>
+          <w:rFonts w:ascii="Calibri" w:hAnsi="Calibri" w:cs="Calibri"/>
+          <w:szCs w:val="22"/>
+        </w:rPr>
+      </w:pPr>
+      <w:r>
+        <w:rPr>
+          <w:rFonts w:ascii="Calibri" w:hAnsi="Calibri" w:cs="Calibri"/>
+          <w:noProof/>
+          <w:szCs w:val="22"/>
+        </w:rPr>
+        <w:lastRenderedPageBreak/>
+        <w:drawing>
+          <wp:inline distT="0" distB="0" distL="0" distR="0" wp14:anchorId="2F735F1D" wp14:editId="521C96E1">
+            <wp:extent cx="6400800" cy="2731135"/>
+            <wp:effectExtent l="0" t="0" r="0" b="0"/>
+            <wp:docPr id="2073785594" name="图片 1"/>
+            <wp:cNvGraphicFramePr>
+              <a:graphicFrameLocks xmlns:a="http://schemas.openxmlformats.org/drawingml/2006/main" noChangeAspect="1"/>
+            </wp:cNvGraphicFramePr>
+            <a:graphic xmlns:a="http://schemas.openxmlformats.org/drawingml/2006/main">
+              <a:graphicData uri="http://schemas.openxmlformats.org/drawingml/2006/picture">
+                <pic:pic xmlns:pic="http://schemas.openxmlformats.org/drawingml/2006/picture">
+                  <pic:nvPicPr>
+                    <pic:cNvPr id="2073785594" name=""/>
+                    <pic:cNvPicPr/>
+                  </pic:nvPicPr>
+                  <pic:blipFill>
+                    <a:blip r:embed="rId11"/>
+                    <a:stretch>
+                      <a:fillRect/>
+                    </a:stretch>
+                  </pic:blipFill>
+                  <pic:spPr>
+                    <a:xfrm>
+                      <a:off x="0" y="0"/>
+                      <a:ext cx="6400800" cy="2731135"/>
+                    </a:xfrm>
+                    <a:prstGeom prst="rect">
+                      <a:avLst/>
+                    </a:prstGeom>
+                  </pic:spPr>
+                </pic:pic>
+              </a:graphicData>
+            </a:graphic>
+          </wp:inline>
+        </w:drawing>
+      </w:r>
+      <w:r>
+        <w:rPr>
+          <w:rFonts w:ascii="Calibri" w:hAnsi="Calibri" w:cs="Calibri"/>
+          <w:szCs w:val="22"/>
+        </w:rPr>
+        <w:t xml:space="preserve"> </w:t>
+      </w:r>
     </w:p>
     <w:p>
       <w:pPr>
         <w:rPr>
-          <w:lang w:val="en-AU"/>
-        </w:rPr>
-      </w:pPr>
+          <w:rFonts w:ascii="Calibri" w:hAnsi="Calibri" w:cs="Calibri"/>
+          <w:szCs w:val="22"/>
+        </w:rPr>
+      </w:pPr>
+      <w:r>
+        <w:rPr>
+          <w:rFonts w:ascii="Calibri" w:hAnsi="Calibri" w:cs="Calibri"/>
+          <w:szCs w:val="22"/>
+        </w:rPr>
+        <w:t>When checkout, the payment is made to Stripe not to the web server.</w:t>
+      </w:r>
     </w:p>
     <w:p>
       <w:pPr>
-        <w:pStyle w:val="2"/>
-        <w:rPr>
-          <w:lang w:val="en-AU"/>
-        </w:rPr>
-      </w:pPr>
-      <w:bookmarkStart w:id="2" w:name="_Hlk151022594"/>
-      <w:r>
-        <w:rPr>
-          <w:lang w:val="en-AU"/>
-        </w:rPr>
-        <w:t>Getting Started</w:t>
+        <w:rPr>
+          <w:rFonts w:ascii="Calibri" w:hAnsi="Calibri" w:cs="Calibri"/>
+          <w:szCs w:val="22"/>
+        </w:rPr>
+      </w:pPr>
+      <w:r>
+        <w:rPr>
+          <w:rFonts w:ascii="Calibri" w:hAnsi="Calibri" w:cs="Calibri"/>
+          <w:noProof/>
+          <w:szCs w:val="22"/>
+        </w:rPr>
+        <w:drawing>
+          <wp:inline distT="0" distB="0" distL="0" distR="0" wp14:anchorId="47200DFB" wp14:editId="1168F913">
+            <wp:extent cx="6400800" cy="2225040"/>
+            <wp:effectExtent l="0" t="0" r="0" b="0"/>
+            <wp:docPr id="1709846750" name="图片 1"/>
+            <wp:cNvGraphicFramePr>
+              <a:graphicFrameLocks xmlns:a="http://schemas.openxmlformats.org/drawingml/2006/main" noChangeAspect="1"/>
+            </wp:cNvGraphicFramePr>
+            <a:graphic xmlns:a="http://schemas.openxmlformats.org/drawingml/2006/main">
+              <a:graphicData uri="http://schemas.openxmlformats.org/drawingml/2006/picture">
+                <pic:pic xmlns:pic="http://schemas.openxmlformats.org/drawingml/2006/picture">
+                  <pic:nvPicPr>
+                    <pic:cNvPr id="1709846750" name=""/>
+                    <pic:cNvPicPr/>
+                  </pic:nvPicPr>
+                  <pic:blipFill>
+                    <a:blip r:embed="rId12"/>
+                    <a:stretch>
+                      <a:fillRect/>
+                    </a:stretch>
+                  </pic:blipFill>
+                  <pic:spPr>
+                    <a:xfrm>
+                      <a:off x="0" y="0"/>
+                      <a:ext cx="6400800" cy="2225040"/>
+                    </a:xfrm>
+                    <a:prstGeom prst="rect">
+                      <a:avLst/>
+                    </a:prstGeom>
+                  </pic:spPr>
+                </pic:pic>
+              </a:graphicData>
+            </a:graphic>
+          </wp:inline>
+        </w:drawing>
       </w:r>
     </w:p>
     <w:p>
@@ -106,90 +1473,615 @@
       </w:pPr>
       <w:r>
         <w:rPr>
-          <w:rFonts w:ascii="Segoe UI" w:hAnsi="Segoe UI" w:cs="Segoe UI"/>
-          <w:color w:val="24292F"/>
-          <w:shd w:val="clear" w:color="auto" w:fill="FFFFFF"/>
-        </w:rPr>
-        <w:t>Clone the reposit</w:t>
-      </w:r>
-      <w:r>
-        <w:rPr>
-          <w:rFonts w:ascii="Segoe UI" w:hAnsi="Segoe UI" w:cs="Segoe UI"/>
-          <w:color w:val="24292F"/>
-          <w:shd w:val="clear" w:color="auto" w:fill="FFFFFF"/>
-        </w:rPr>
-        <w:t>ory and run in development mode in Visual Studio.</w:t>
-      </w:r>
-    </w:p>
-    <w:bookmarkEnd w:id="2"/>
-    <w:p>
-      <w:pPr>
-        <w:rPr>
           <w:lang w:val="en-AU"/>
         </w:rPr>
-      </w:pPr>
+        <w:t>Users can view whether their payment is pending or has been received.</w:t>
+      </w:r>
     </w:p>
     <w:p>
       <w:pPr>
-        <w:rPr>
-          <w:rFonts w:asciiTheme="majorHAnsi" w:eastAsiaTheme="majorEastAsia" w:hAnsiTheme="majorHAnsi" w:cstheme="majorBidi"/>
-          <w:color w:val="C0504D" w:themeColor="accent2"/>
-          <w:sz w:val="36"/>
-          <w:szCs w:val="36"/>
+        <w:jc w:val="center"/>
+        <w:rPr>
           <w:lang w:val="en-AU"/>
         </w:rPr>
       </w:pPr>
-      <w:bookmarkStart w:id="3" w:name="_Hlk151022333"/>
-      <w:r>
-        <w:rPr>
-          <w:rFonts w:asciiTheme="majorHAnsi" w:eastAsiaTheme="majorEastAsia" w:hAnsiTheme="majorHAnsi" w:cstheme="majorBidi"/>
-          <w:color w:val="C0504D" w:themeColor="accent2"/>
-          <w:sz w:val="36"/>
-          <w:szCs w:val="36"/>
+      <w:r>
+        <w:rPr>
+          <w:noProof/>
           <w:lang w:val="en-AU"/>
         </w:rPr>
-        <w:t>Technologies Used</w:t>
-      </w:r>
-    </w:p>
-    <w:bookmarkEnd w:id="3"/>
-    <w:p>
-      <w:pPr>
-        <w:rPr>
-          <w:lang w:val="en-AU"/>
-        </w:rPr>
-      </w:pPr>
-      <w:r>
-        <w:rPr>
-          <w:lang w:val="en-AU"/>
-        </w:rPr>
-        <w:t>React.js in TypeScript</w:t>
+        <w:drawing>
+          <wp:inline distT="0" distB="0" distL="0" distR="0" wp14:anchorId="164B734A" wp14:editId="43C91DA7">
+            <wp:extent cx="3709686" cy="1410726"/>
+            <wp:effectExtent l="0" t="0" r="0" b="0"/>
+            <wp:docPr id="483692144" name="图片 1"/>
+            <wp:cNvGraphicFramePr>
+              <a:graphicFrameLocks xmlns:a="http://schemas.openxmlformats.org/drawingml/2006/main" noChangeAspect="1"/>
+            </wp:cNvGraphicFramePr>
+            <a:graphic xmlns:a="http://schemas.openxmlformats.org/drawingml/2006/main">
+              <a:graphicData uri="http://schemas.openxmlformats.org/drawingml/2006/picture">
+                <pic:pic xmlns:pic="http://schemas.openxmlformats.org/drawingml/2006/picture">
+                  <pic:nvPicPr>
+                    <pic:cNvPr id="483692144" name=""/>
+                    <pic:cNvPicPr/>
+                  </pic:nvPicPr>
+                  <pic:blipFill>
+                    <a:blip r:embed="rId13"/>
+                    <a:stretch>
+                      <a:fillRect/>
+                    </a:stretch>
+                  </pic:blipFill>
+                  <pic:spPr>
+                    <a:xfrm>
+                      <a:off x="0" y="0"/>
+                      <a:ext cx="3712406" cy="1411760"/>
+                    </a:xfrm>
+                    <a:prstGeom prst="rect">
+                      <a:avLst/>
+                    </a:prstGeom>
+                  </pic:spPr>
+                </pic:pic>
+              </a:graphicData>
+            </a:graphic>
+          </wp:inline>
+        </w:drawing>
       </w:r>
     </w:p>
     <w:p>
       <w:pPr>
-        <w:rPr>
-          <w:lang w:val="en-AU"/>
-        </w:rPr>
-      </w:pPr>
-      <w:r>
-        <w:rPr>
-          <w:lang w:val="en-AU"/>
-        </w:rPr>
-        <w:t>ASP.NET Core, EF Core</w:t>
+        <w:pStyle w:val="2"/>
+      </w:pPr>
+      <w:r>
+        <w:t>Build With</w:t>
       </w:r>
     </w:p>
     <w:p>
       <w:pPr>
+        <w:spacing w:after="0" w:line="240" w:lineRule="auto"/>
+        <w:rPr>
+          <w:rFonts w:ascii="Calibri" w:eastAsia="Times New Roman" w:hAnsi="Calibri" w:cs="Calibri"/>
+          <w:szCs w:val="22"/>
+          <w:lang w:eastAsia="zh-CN"/>
+        </w:rPr>
+      </w:pPr>
+      <w:bookmarkStart w:id="6" w:name="_Hlk151740259"/>
+      <w:r>
+        <w:rPr>
+          <w:rFonts w:ascii="Calibri" w:eastAsia="Times New Roman" w:hAnsi="Calibri" w:cs="Calibri"/>
+          <w:szCs w:val="22"/>
+          <w:lang w:eastAsia="zh-CN"/>
+        </w:rPr>
+        <w:t xml:space="preserve">Backend - ASP.NET </w:t>
+      </w:r>
+      <w:r>
+        <w:rPr>
+          <w:rFonts w:ascii="Calibri" w:eastAsia="Times New Roman" w:hAnsi="Calibri" w:cs="Calibri"/>
+          <w:szCs w:val="22"/>
+          <w:lang w:eastAsia="zh-CN"/>
+        </w:rPr>
+        <w:t>Core</w:t>
+      </w:r>
+      <w:r>
+        <w:rPr>
+          <w:rFonts w:ascii="Calibri" w:eastAsia="Times New Roman" w:hAnsi="Calibri" w:cs="Calibri"/>
+          <w:szCs w:val="22"/>
+          <w:lang w:eastAsia="zh-CN"/>
+        </w:rPr>
+        <w:t xml:space="preserve"> </w:t>
+      </w:r>
+      <w:bookmarkEnd w:id="6"/>
+      <w:r>
+        <w:rPr>
+          <w:rFonts w:ascii="Calibri" w:eastAsia="Times New Roman" w:hAnsi="Calibri" w:cs="Calibri"/>
+          <w:szCs w:val="22"/>
+          <w:lang w:eastAsia="zh-CN"/>
+        </w:rPr>
+        <w:t>with</w:t>
+      </w:r>
+    </w:p>
+    <w:p>
+      <w:pPr>
+        <w:numPr>
+          <w:ilvl w:val="0"/>
+          <w:numId w:val="5"/>
+        </w:numPr>
+        <w:spacing w:after="0" w:line="240" w:lineRule="auto"/>
+        <w:textAlignment w:val="center"/>
+        <w:rPr>
+          <w:rFonts w:ascii="Calibri" w:eastAsia="Times New Roman" w:hAnsi="Calibri" w:cs="Calibri"/>
+          <w:szCs w:val="22"/>
+          <w:lang w:eastAsia="zh-CN"/>
+        </w:rPr>
+      </w:pPr>
+      <w:proofErr w:type="spellStart"/>
+      <w:r>
+        <w:rPr>
+          <w:rFonts w:ascii="Calibri" w:eastAsia="Times New Roman" w:hAnsi="Calibri" w:cs="Calibri"/>
+          <w:szCs w:val="22"/>
+          <w:lang w:eastAsia="zh-CN"/>
+        </w:rPr>
+        <w:t>AutoMapper</w:t>
+      </w:r>
+      <w:proofErr w:type="spellEnd"/>
+    </w:p>
+    <w:p>
+      <w:pPr>
+        <w:numPr>
+          <w:ilvl w:val="0"/>
+          <w:numId w:val="5"/>
+        </w:numPr>
+        <w:spacing w:after="0" w:line="240" w:lineRule="auto"/>
+        <w:textAlignment w:val="center"/>
+        <w:rPr>
+          <w:rFonts w:ascii="Calibri" w:eastAsia="Times New Roman" w:hAnsi="Calibri" w:cs="Calibri"/>
+          <w:szCs w:val="22"/>
+          <w:lang w:eastAsia="zh-CN"/>
+        </w:rPr>
+      </w:pPr>
+      <w:proofErr w:type="spellStart"/>
+      <w:r>
+        <w:rPr>
+          <w:rFonts w:ascii="Calibri" w:eastAsia="Times New Roman" w:hAnsi="Calibri" w:cs="Calibri"/>
+          <w:szCs w:val="22"/>
+          <w:lang w:eastAsia="zh-CN"/>
+        </w:rPr>
+        <w:t>CloudinaryDotNet</w:t>
+      </w:r>
+      <w:proofErr w:type="spellEnd"/>
+    </w:p>
+    <w:p>
+      <w:pPr>
+        <w:numPr>
+          <w:ilvl w:val="0"/>
+          <w:numId w:val="5"/>
+        </w:numPr>
+        <w:spacing w:after="0" w:line="240" w:lineRule="auto"/>
+        <w:textAlignment w:val="center"/>
+        <w:rPr>
+          <w:rFonts w:ascii="Calibri" w:eastAsia="Times New Roman" w:hAnsi="Calibri" w:cs="Calibri"/>
+          <w:szCs w:val="22"/>
+          <w:lang w:eastAsia="zh-CN"/>
+        </w:rPr>
+      </w:pPr>
+      <w:r>
+        <w:rPr>
+          <w:rFonts w:ascii="Calibri" w:eastAsia="Times New Roman" w:hAnsi="Calibri" w:cs="Calibri"/>
+          <w:szCs w:val="22"/>
+          <w:lang w:eastAsia="zh-CN"/>
+        </w:rPr>
+        <w:lastRenderedPageBreak/>
+        <w:t>Stripe.net</w:t>
+      </w:r>
+    </w:p>
+    <w:p>
+      <w:pPr>
+        <w:spacing w:after="0" w:line="240" w:lineRule="auto"/>
+        <w:rPr>
+          <w:rFonts w:ascii="Calibri" w:eastAsia="Times New Roman" w:hAnsi="Calibri" w:cs="Calibri"/>
+          <w:szCs w:val="22"/>
+          <w:lang w:eastAsia="zh-CN"/>
+        </w:rPr>
+      </w:pPr>
+      <w:bookmarkStart w:id="7" w:name="_Hlk151740292"/>
+      <w:r>
+        <w:rPr>
+          <w:rFonts w:ascii="Calibri" w:eastAsia="Times New Roman" w:hAnsi="Calibri" w:cs="Calibri"/>
+          <w:szCs w:val="22"/>
+          <w:lang w:eastAsia="zh-CN"/>
+        </w:rPr>
+        <w:t>Frontend - React Typescript with</w:t>
+      </w:r>
+    </w:p>
+    <w:bookmarkEnd w:id="7"/>
+    <w:p>
+      <w:pPr>
+        <w:numPr>
+          <w:ilvl w:val="0"/>
+          <w:numId w:val="6"/>
+        </w:numPr>
+        <w:spacing w:after="0" w:line="240" w:lineRule="auto"/>
+        <w:textAlignment w:val="center"/>
+        <w:rPr>
+          <w:rFonts w:ascii="Calibri" w:eastAsia="Times New Roman" w:hAnsi="Calibri" w:cs="Calibri"/>
+          <w:szCs w:val="22"/>
+          <w:lang w:eastAsia="zh-CN"/>
+        </w:rPr>
+      </w:pPr>
+      <w:r>
+        <w:rPr>
+          <w:rFonts w:ascii="Calibri" w:eastAsia="Times New Roman" w:hAnsi="Calibri" w:cs="Calibri"/>
+          <w:szCs w:val="22"/>
+          <w:lang w:eastAsia="zh-CN"/>
+        </w:rPr>
+        <w:t>Axios</w:t>
+      </w:r>
+    </w:p>
+    <w:p>
+      <w:pPr>
+        <w:numPr>
+          <w:ilvl w:val="0"/>
+          <w:numId w:val="6"/>
+        </w:numPr>
+        <w:spacing w:after="0" w:line="240" w:lineRule="auto"/>
+        <w:textAlignment w:val="center"/>
+        <w:rPr>
+          <w:rFonts w:ascii="Calibri" w:eastAsia="Times New Roman" w:hAnsi="Calibri" w:cs="Calibri"/>
+          <w:szCs w:val="22"/>
+          <w:lang w:eastAsia="zh-CN"/>
+        </w:rPr>
+      </w:pPr>
+      <w:r>
+        <w:rPr>
+          <w:rFonts w:ascii="Calibri" w:eastAsia="Times New Roman" w:hAnsi="Calibri" w:cs="Calibri"/>
+          <w:szCs w:val="22"/>
+          <w:lang w:eastAsia="zh-CN"/>
+        </w:rPr>
+        <w:t>Mui</w:t>
+      </w:r>
+    </w:p>
+    <w:p>
+      <w:pPr>
+        <w:numPr>
+          <w:ilvl w:val="0"/>
+          <w:numId w:val="6"/>
+        </w:numPr>
+        <w:spacing w:after="0" w:line="240" w:lineRule="auto"/>
+        <w:textAlignment w:val="center"/>
+        <w:rPr>
+          <w:rFonts w:ascii="Calibri" w:eastAsia="Times New Roman" w:hAnsi="Calibri" w:cs="Calibri"/>
+          <w:szCs w:val="22"/>
+          <w:lang w:val="en-AU" w:eastAsia="zh-CN"/>
+        </w:rPr>
+      </w:pPr>
+      <w:bookmarkStart w:id="8" w:name="_Hlk151740361"/>
+      <w:r>
+        <w:rPr>
+          <w:rFonts w:ascii="Calibri" w:eastAsia="Times New Roman" w:hAnsi="Calibri" w:cs="Calibri"/>
+          <w:szCs w:val="22"/>
+          <w:lang w:eastAsia="zh-CN"/>
+        </w:rPr>
+        <w:t>r</w:t>
+      </w:r>
+      <w:proofErr w:type="spellStart"/>
+      <w:r>
+        <w:rPr>
+          <w:rFonts w:ascii="Calibri" w:eastAsia="Times New Roman" w:hAnsi="Calibri" w:cs="Calibri"/>
+          <w:szCs w:val="22"/>
+          <w:lang w:val="en-AU" w:eastAsia="zh-CN"/>
+        </w:rPr>
+        <w:t>eact-</w:t>
+      </w:r>
+      <w:proofErr w:type="gramStart"/>
+      <w:r>
+        <w:rPr>
+          <w:rFonts w:ascii="Calibri" w:eastAsia="Times New Roman" w:hAnsi="Calibri" w:cs="Calibri"/>
+          <w:szCs w:val="22"/>
+          <w:lang w:val="en-AU" w:eastAsia="zh-CN"/>
+        </w:rPr>
+        <w:t>dropzone</w:t>
+      </w:r>
+      <w:proofErr w:type="spellEnd"/>
+      <w:proofErr w:type="gramEnd"/>
+    </w:p>
+    <w:bookmarkEnd w:id="8"/>
+    <w:p>
+      <w:pPr>
+        <w:numPr>
+          <w:ilvl w:val="0"/>
+          <w:numId w:val="6"/>
+        </w:numPr>
+        <w:spacing w:after="0" w:line="240" w:lineRule="auto"/>
+        <w:textAlignment w:val="center"/>
+        <w:rPr>
+          <w:rFonts w:ascii="Calibri" w:eastAsia="Times New Roman" w:hAnsi="Calibri" w:cs="Calibri"/>
+          <w:szCs w:val="22"/>
+          <w:lang w:val="en-AU" w:eastAsia="zh-CN"/>
+        </w:rPr>
+      </w:pPr>
+      <w:r>
+        <w:rPr>
+          <w:rFonts w:ascii="Calibri" w:eastAsia="Times New Roman" w:hAnsi="Calibri" w:cs="Calibri"/>
+          <w:szCs w:val="22"/>
+          <w:lang w:eastAsia="zh-CN"/>
+        </w:rPr>
+        <w:t>r</w:t>
+      </w:r>
+      <w:proofErr w:type="spellStart"/>
+      <w:r>
+        <w:rPr>
+          <w:rFonts w:ascii="Calibri" w:eastAsia="Times New Roman" w:hAnsi="Calibri" w:cs="Calibri"/>
+          <w:szCs w:val="22"/>
+          <w:lang w:val="en-AU" w:eastAsia="zh-CN"/>
+        </w:rPr>
+        <w:t>eact</w:t>
+      </w:r>
+      <w:proofErr w:type="spellEnd"/>
+      <w:r>
+        <w:rPr>
+          <w:rFonts w:ascii="Calibri" w:eastAsia="Times New Roman" w:hAnsi="Calibri" w:cs="Calibri"/>
+          <w:szCs w:val="22"/>
+          <w:lang w:val="en-AU" w:eastAsia="zh-CN"/>
+        </w:rPr>
+        <w:t>-hook-</w:t>
+      </w:r>
+      <w:proofErr w:type="gramStart"/>
+      <w:r>
+        <w:rPr>
+          <w:rFonts w:ascii="Calibri" w:eastAsia="Times New Roman" w:hAnsi="Calibri" w:cs="Calibri"/>
+          <w:szCs w:val="22"/>
+          <w:lang w:val="en-AU" w:eastAsia="zh-CN"/>
+        </w:rPr>
+        <w:t>form</w:t>
+      </w:r>
+      <w:proofErr w:type="gramEnd"/>
+    </w:p>
+    <w:p>
+      <w:pPr>
+        <w:numPr>
+          <w:ilvl w:val="0"/>
+          <w:numId w:val="6"/>
+        </w:numPr>
+        <w:spacing w:after="0" w:line="240" w:lineRule="auto"/>
+        <w:textAlignment w:val="center"/>
+        <w:rPr>
+          <w:rFonts w:ascii="Calibri" w:eastAsia="Times New Roman" w:hAnsi="Calibri" w:cs="Calibri"/>
+          <w:szCs w:val="22"/>
+          <w:lang w:eastAsia="zh-CN"/>
+        </w:rPr>
+      </w:pPr>
+      <w:r>
+        <w:rPr>
+          <w:rFonts w:ascii="Calibri" w:eastAsia="Times New Roman" w:hAnsi="Calibri" w:cs="Calibri"/>
+          <w:szCs w:val="22"/>
+          <w:lang w:eastAsia="zh-CN"/>
+        </w:rPr>
+        <w:t>React Redux</w:t>
+      </w:r>
+    </w:p>
+    <w:p>
+      <w:pPr>
+        <w:numPr>
+          <w:ilvl w:val="0"/>
+          <w:numId w:val="6"/>
+        </w:numPr>
+        <w:spacing w:after="0" w:line="240" w:lineRule="auto"/>
+        <w:textAlignment w:val="center"/>
+        <w:rPr>
+          <w:rFonts w:ascii="Calibri" w:eastAsia="Times New Roman" w:hAnsi="Calibri" w:cs="Calibri"/>
+          <w:szCs w:val="22"/>
+          <w:lang w:eastAsia="zh-CN"/>
+        </w:rPr>
+      </w:pPr>
+      <w:bookmarkStart w:id="9" w:name="_Hlk151740376"/>
+      <w:r>
+        <w:rPr>
+          <w:rFonts w:ascii="Calibri" w:eastAsia="Times New Roman" w:hAnsi="Calibri" w:cs="Calibri"/>
+          <w:szCs w:val="22"/>
+          <w:lang w:eastAsia="zh-CN"/>
+        </w:rPr>
+        <w:t>React Router</w:t>
+      </w:r>
+    </w:p>
+    <w:bookmarkEnd w:id="9"/>
+    <w:p>
+      <w:pPr>
+        <w:numPr>
+          <w:ilvl w:val="0"/>
+          <w:numId w:val="6"/>
+        </w:numPr>
+        <w:spacing w:after="0" w:line="240" w:lineRule="auto"/>
+        <w:textAlignment w:val="center"/>
+        <w:rPr>
+          <w:rFonts w:ascii="Calibri" w:eastAsia="Times New Roman" w:hAnsi="Calibri" w:cs="Calibri"/>
+          <w:szCs w:val="22"/>
+          <w:lang w:val="en-AU" w:eastAsia="zh-CN"/>
+        </w:rPr>
+      </w:pPr>
+      <w:r>
+        <w:rPr>
+          <w:rFonts w:ascii="Calibri" w:eastAsia="Times New Roman" w:hAnsi="Calibri" w:cs="Calibri"/>
+          <w:szCs w:val="22"/>
+          <w:lang w:val="en-AU" w:eastAsia="zh-CN"/>
+        </w:rPr>
+        <w:t>react-</w:t>
+      </w:r>
+      <w:proofErr w:type="spellStart"/>
+      <w:proofErr w:type="gramStart"/>
+      <w:r>
+        <w:rPr>
+          <w:rFonts w:ascii="Calibri" w:eastAsia="Times New Roman" w:hAnsi="Calibri" w:cs="Calibri"/>
+          <w:szCs w:val="22"/>
+          <w:lang w:val="en-AU" w:eastAsia="zh-CN"/>
+        </w:rPr>
+        <w:t>toastify</w:t>
+      </w:r>
+      <w:proofErr w:type="spellEnd"/>
+      <w:proofErr w:type="gramEnd"/>
+    </w:p>
+    <w:p>
+      <w:pPr>
+        <w:numPr>
+          <w:ilvl w:val="0"/>
+          <w:numId w:val="6"/>
+        </w:numPr>
+        <w:spacing w:after="0" w:line="240" w:lineRule="auto"/>
+        <w:textAlignment w:val="center"/>
+        <w:rPr>
+          <w:rFonts w:ascii="Calibri" w:eastAsia="Times New Roman" w:hAnsi="Calibri" w:cs="Calibri"/>
+          <w:szCs w:val="22"/>
+          <w:lang w:val="en-AU" w:eastAsia="zh-CN"/>
+        </w:rPr>
+      </w:pPr>
+      <w:r>
+        <w:rPr>
+          <w:rFonts w:ascii="Calibri" w:eastAsia="Times New Roman" w:hAnsi="Calibri" w:cs="Calibri"/>
+          <w:szCs w:val="22"/>
+          <w:lang w:eastAsia="zh-CN"/>
+        </w:rPr>
+        <w:t xml:space="preserve">react-slick: React port of </w:t>
+      </w:r>
+      <w:r>
+        <w:rPr>
+          <w:rFonts w:ascii="Calibri" w:eastAsia="Times New Roman" w:hAnsi="Calibri" w:cs="Calibri"/>
+          <w:szCs w:val="22"/>
+          <w:lang w:val="en-AU" w:eastAsia="zh-CN"/>
+        </w:rPr>
+        <w:t xml:space="preserve">slick </w:t>
+      </w:r>
+      <w:proofErr w:type="gramStart"/>
+      <w:r>
+        <w:rPr>
+          <w:rFonts w:ascii="Calibri" w:eastAsia="Times New Roman" w:hAnsi="Calibri" w:cs="Calibri"/>
+          <w:szCs w:val="22"/>
+          <w:lang w:val="en-AU" w:eastAsia="zh-CN"/>
+        </w:rPr>
+        <w:t>carousel</w:t>
+      </w:r>
+      <w:proofErr w:type="gramEnd"/>
+    </w:p>
+    <w:p>
+      <w:pPr>
+        <w:numPr>
+          <w:ilvl w:val="0"/>
+          <w:numId w:val="6"/>
+        </w:numPr>
+        <w:spacing w:after="0" w:line="240" w:lineRule="auto"/>
+        <w:textAlignment w:val="center"/>
+        <w:rPr>
+          <w:rFonts w:ascii="Calibri" w:eastAsia="Times New Roman" w:hAnsi="Calibri" w:cs="Calibri"/>
+          <w:szCs w:val="22"/>
+          <w:lang w:val="en-AU" w:eastAsia="zh-CN"/>
+        </w:rPr>
+      </w:pPr>
+      <w:r>
+        <w:rPr>
+          <w:rFonts w:ascii="Calibri" w:eastAsia="Times New Roman" w:hAnsi="Calibri" w:cs="Calibri"/>
+          <w:szCs w:val="22"/>
+          <w:lang w:eastAsia="zh-CN"/>
+        </w:rPr>
+        <w:t>y</w:t>
+      </w:r>
+      <w:r>
+        <w:rPr>
+          <w:rFonts w:ascii="Calibri" w:eastAsia="Times New Roman" w:hAnsi="Calibri" w:cs="Calibri"/>
+          <w:szCs w:val="22"/>
+          <w:lang w:val="en-AU" w:eastAsia="zh-CN"/>
+        </w:rPr>
+        <w:t xml:space="preserve">up: </w:t>
+      </w:r>
+      <w:r>
+        <w:rPr>
+          <w:rFonts w:ascii="Calibri" w:eastAsia="Times New Roman" w:hAnsi="Calibri" w:cs="Calibri"/>
+          <w:szCs w:val="22"/>
+          <w:lang w:eastAsia="zh-CN"/>
+        </w:rPr>
+        <w:t xml:space="preserve">for react-hook-form </w:t>
+      </w:r>
+      <w:r>
+        <w:rPr>
+          <w:rFonts w:ascii="Calibri" w:eastAsia="Times New Roman" w:hAnsi="Calibri" w:cs="Calibri"/>
+          <w:szCs w:val="22"/>
+          <w:lang w:val="en-AU" w:eastAsia="zh-CN"/>
+        </w:rPr>
+        <w:t xml:space="preserve">input </w:t>
+      </w:r>
+      <w:proofErr w:type="gramStart"/>
+      <w:r>
+        <w:rPr>
+          <w:rFonts w:ascii="Calibri" w:eastAsia="Times New Roman" w:hAnsi="Calibri" w:cs="Calibri"/>
+          <w:szCs w:val="22"/>
+          <w:lang w:val="en-AU" w:eastAsia="zh-CN"/>
+        </w:rPr>
+        <w:t>validation</w:t>
+      </w:r>
+      <w:proofErr w:type="gramEnd"/>
+    </w:p>
+    <w:p>
+      <w:pPr>
+        <w:spacing w:after="0" w:line="240" w:lineRule="auto"/>
+        <w:rPr>
+          <w:rFonts w:ascii="Calibri" w:eastAsia="Times New Roman" w:hAnsi="Calibri" w:cs="Calibri"/>
+          <w:szCs w:val="22"/>
+          <w:lang w:val="en-AU" w:eastAsia="zh-CN"/>
+        </w:rPr>
+      </w:pPr>
+      <w:r>
+        <w:rPr>
+          <w:rFonts w:ascii="Calibri" w:eastAsia="Times New Roman" w:hAnsi="Calibri" w:cs="Calibri"/>
+          <w:szCs w:val="22"/>
+          <w:lang w:val="en-AU" w:eastAsia="zh-CN"/>
+        </w:rPr>
+        <w:t>SaaS</w:t>
+      </w:r>
+    </w:p>
+    <w:p>
+      <w:pPr>
+        <w:numPr>
+          <w:ilvl w:val="0"/>
+          <w:numId w:val="7"/>
+        </w:numPr>
+        <w:spacing w:after="0" w:line="240" w:lineRule="auto"/>
+        <w:textAlignment w:val="center"/>
+        <w:rPr>
+          <w:rFonts w:ascii="Calibri" w:eastAsia="Times New Roman" w:hAnsi="Calibri" w:cs="Calibri"/>
+          <w:szCs w:val="22"/>
+          <w:lang w:val="en-AU" w:eastAsia="zh-CN"/>
+        </w:rPr>
+      </w:pPr>
+      <w:proofErr w:type="spellStart"/>
+      <w:r>
+        <w:rPr>
+          <w:rFonts w:ascii="Calibri" w:eastAsia="Times New Roman" w:hAnsi="Calibri" w:cs="Calibri"/>
+          <w:szCs w:val="22"/>
+          <w:lang w:val="en-AU" w:eastAsia="zh-CN"/>
+        </w:rPr>
+        <w:t>Cloudinary</w:t>
+      </w:r>
+      <w:proofErr w:type="spellEnd"/>
+    </w:p>
+    <w:p>
+      <w:pPr>
+        <w:numPr>
+          <w:ilvl w:val="0"/>
+          <w:numId w:val="7"/>
+        </w:numPr>
+        <w:spacing w:after="0" w:line="240" w:lineRule="auto"/>
+        <w:textAlignment w:val="center"/>
+        <w:rPr>
+          <w:rFonts w:ascii="Calibri" w:eastAsia="Times New Roman" w:hAnsi="Calibri" w:cs="Calibri"/>
+          <w:szCs w:val="22"/>
+          <w:lang w:val="en-AU" w:eastAsia="zh-CN"/>
+        </w:rPr>
+      </w:pPr>
+      <w:r>
+        <w:rPr>
+          <w:rFonts w:ascii="Calibri" w:eastAsia="Times New Roman" w:hAnsi="Calibri" w:cs="Calibri"/>
+          <w:szCs w:val="22"/>
+          <w:lang w:val="en-AU" w:eastAsia="zh-CN"/>
+        </w:rPr>
+        <w:t>Stripe</w:t>
+      </w:r>
+    </w:p>
+    <w:p>
+      <w:pPr>
         <w:rPr>
           <w:lang w:val="en-AU"/>
         </w:rPr>
       </w:pPr>
-      <w:r>
+    </w:p>
+    <w:p>
+      <w:pPr>
         <w:rPr>
           <w:lang w:val="en-AU"/>
         </w:rPr>
-        <w:t>Azure SQL Server</w:t>
-      </w:r>
+      </w:pPr>
+    </w:p>
+    <w:p>
+      <w:pPr>
+        <w:rPr>
+          <w:lang w:val="en-AU"/>
+        </w:rPr>
+      </w:pPr>
     </w:p>
     <w:sectPr>
       <w:pgSz w:w="12240" w:h="15840"/>
@@ -248,6 +2140,824 @@
 <file path=word/numbering.xml><?xml version="1.0" encoding="utf-8"?>
 <w:numbering xmlns:wpc="http://schemas.microsoft.com/office/word/2010/wordprocessingCanvas" xmlns:cx="http://schemas.microsoft.com/office/drawing/2014/chartex" xmlns:cx1="http://schemas.microsoft.com/office/drawing/2015/9/8/chartex" xmlns:cx2="http://schemas.microsoft.com/office/drawing/2015/10/21/chartex" xmlns:cx3="http://schemas.microsoft.com/office/drawing/2016/5/9/chartex" xmlns:cx4="http://schemas.microsoft.com/office/drawing/2016/5/10/chartex" xmlns:cx5="http://schemas.microsoft.com/office/drawing/2016/5/11/chartex" xmlns:cx6="http://schemas.microsoft.com/office/drawing/2016/5/12/chartex" xmlns:cx7="http://schemas.microsoft.com/office/drawing/2016/5/13/chartex" xmlns:cx8="http://schemas.microsoft.com/office/drawing/2016/5/14/chartex" xmlns:mc="http://schemas.openxmlformats.org/markup-compatibility/2006" xmlns:aink="http://schemas.microsoft.com/office/drawing/2016/ink" xmlns:am3d="http://schemas.microsoft.com/office/drawing/2017/model3d" xmlns:o="urn:schemas-microsoft-com:office:office" xmlns:oel="http://schemas.microsoft.com/office/2019/extlst" xmlns:r="http://schemas.openxmlformats.org/officeDocument/2006/relationships" xmlns:m="http://schemas.openxmlformats.org/officeDocument/2006/math" xmlns:v="urn:schemas-microsoft-com:vml" xmlns:wp14="http://schemas.microsoft.com/office/word/2010/wordprocessingDrawing" xmlns:wp="http://schemas.openxmlformats.org/drawingml/2006/wordprocessingDrawing" xmlns:w10="urn:schemas-microsoft-com:office:word" xmlns:w="http://schemas.openxmlformats.org/wordprocessingml/2006/main" xmlns:w14="http://schemas.microsoft.com/office/word/2010/wordml" xmlns:w15="http://schemas.microsoft.com/office/word/2012/wordml" xmlns:w16cex="http://schemas.microsoft.com/office/word/2018/wordml/cex" xmlns:w16cid="http://schemas.microsoft.com/office/word/2016/wordml/cid" xmlns:w16="http://schemas.microsoft.com/office/word/2018/wordml" xmlns:w16sdtdh="http://schemas.microsoft.com/office/word/2020/wordml/sdtdatahash" xmlns:w16se="http://schemas.microsoft.com/office/word/2015/wordml/symex" xmlns:wpg="http://schemas.microsoft.com/office/word/2010/wordprocessingGroup" xmlns:wpi="http://schemas.microsoft.com/office/word/2010/wordprocessingInk" xmlns:wne="http://schemas.microsoft.com/office/word/2006/wordml" xmlns:wps="http://schemas.microsoft.com/office/word/2010/wordprocessingShape" mc:Ignorable="w14 w15 w16se w16cid w16 w16cex w16sdtdh wp14">
   <w:abstractNum w:abstractNumId="0" w15:restartNumberingAfterBreak="0">
+    <w:nsid w:val="03586866"/>
+    <w:multiLevelType w:val="multilevel"/>
+    <w:tmpl w:val="395E28A4"/>
+    <w:lvl w:ilvl="0">
+      <w:start w:val="1"/>
+      <w:numFmt w:val="bullet"/>
+      <w:lvlText w:val="o"/>
+      <w:lvlJc w:val="left"/>
+      <w:pPr>
+        <w:tabs>
+          <w:tab w:val="num" w:pos="720"/>
+        </w:tabs>
+        <w:ind w:left="720" w:hanging="360"/>
+      </w:pPr>
+      <w:rPr>
+        <w:rFonts w:ascii="Courier New" w:hAnsi="Courier New" w:hint="default"/>
+        <w:sz w:val="20"/>
+      </w:rPr>
+    </w:lvl>
+    <w:lvl w:ilvl="1">
+      <w:start w:val="1"/>
+      <w:numFmt w:val="bullet"/>
+      <w:lvlText w:val=""/>
+      <w:lvlJc w:val="left"/>
+      <w:pPr>
+        <w:tabs>
+          <w:tab w:val="num" w:pos="1440"/>
+        </w:tabs>
+        <w:ind w:left="1440" w:hanging="360"/>
+      </w:pPr>
+      <w:rPr>
+        <w:rFonts w:ascii="Symbol" w:hAnsi="Symbol" w:hint="default"/>
+        <w:sz w:val="20"/>
+      </w:rPr>
+    </w:lvl>
+    <w:lvl w:ilvl="2" w:tentative="1">
+      <w:start w:val="1"/>
+      <w:numFmt w:val="bullet"/>
+      <w:lvlText w:val="o"/>
+      <w:lvlJc w:val="left"/>
+      <w:pPr>
+        <w:tabs>
+          <w:tab w:val="num" w:pos="2160"/>
+        </w:tabs>
+        <w:ind w:left="2160" w:hanging="360"/>
+      </w:pPr>
+      <w:rPr>
+        <w:rFonts w:ascii="Courier New" w:hAnsi="Courier New" w:hint="default"/>
+        <w:sz w:val="20"/>
+      </w:rPr>
+    </w:lvl>
+    <w:lvl w:ilvl="3" w:tentative="1">
+      <w:start w:val="1"/>
+      <w:numFmt w:val="bullet"/>
+      <w:lvlText w:val="o"/>
+      <w:lvlJc w:val="left"/>
+      <w:pPr>
+        <w:tabs>
+          <w:tab w:val="num" w:pos="2880"/>
+        </w:tabs>
+        <w:ind w:left="2880" w:hanging="360"/>
+      </w:pPr>
+      <w:rPr>
+        <w:rFonts w:ascii="Courier New" w:hAnsi="Courier New" w:hint="default"/>
+        <w:sz w:val="20"/>
+      </w:rPr>
+    </w:lvl>
+    <w:lvl w:ilvl="4" w:tentative="1">
+      <w:start w:val="1"/>
+      <w:numFmt w:val="bullet"/>
+      <w:lvlText w:val="o"/>
+      <w:lvlJc w:val="left"/>
+      <w:pPr>
+        <w:tabs>
+          <w:tab w:val="num" w:pos="3600"/>
+        </w:tabs>
+        <w:ind w:left="3600" w:hanging="360"/>
+      </w:pPr>
+      <w:rPr>
+        <w:rFonts w:ascii="Courier New" w:hAnsi="Courier New" w:hint="default"/>
+        <w:sz w:val="20"/>
+      </w:rPr>
+    </w:lvl>
+    <w:lvl w:ilvl="5" w:tentative="1">
+      <w:start w:val="1"/>
+      <w:numFmt w:val="bullet"/>
+      <w:lvlText w:val="o"/>
+      <w:lvlJc w:val="left"/>
+      <w:pPr>
+        <w:tabs>
+          <w:tab w:val="num" w:pos="4320"/>
+        </w:tabs>
+        <w:ind w:left="4320" w:hanging="360"/>
+      </w:pPr>
+      <w:rPr>
+        <w:rFonts w:ascii="Courier New" w:hAnsi="Courier New" w:hint="default"/>
+        <w:sz w:val="20"/>
+      </w:rPr>
+    </w:lvl>
+    <w:lvl w:ilvl="6" w:tentative="1">
+      <w:start w:val="1"/>
+      <w:numFmt w:val="bullet"/>
+      <w:lvlText w:val="o"/>
+      <w:lvlJc w:val="left"/>
+      <w:pPr>
+        <w:tabs>
+          <w:tab w:val="num" w:pos="5040"/>
+        </w:tabs>
+        <w:ind w:left="5040" w:hanging="360"/>
+      </w:pPr>
+      <w:rPr>
+        <w:rFonts w:ascii="Courier New" w:hAnsi="Courier New" w:hint="default"/>
+        <w:sz w:val="20"/>
+      </w:rPr>
+    </w:lvl>
+    <w:lvl w:ilvl="7" w:tentative="1">
+      <w:start w:val="1"/>
+      <w:numFmt w:val="bullet"/>
+      <w:lvlText w:val="o"/>
+      <w:lvlJc w:val="left"/>
+      <w:pPr>
+        <w:tabs>
+          <w:tab w:val="num" w:pos="5760"/>
+        </w:tabs>
+        <w:ind w:left="5760" w:hanging="360"/>
+      </w:pPr>
+      <w:rPr>
+        <w:rFonts w:ascii="Courier New" w:hAnsi="Courier New" w:hint="default"/>
+        <w:sz w:val="20"/>
+      </w:rPr>
+    </w:lvl>
+    <w:lvl w:ilvl="8" w:tentative="1">
+      <w:start w:val="1"/>
+      <w:numFmt w:val="bullet"/>
+      <w:lvlText w:val="o"/>
+      <w:lvlJc w:val="left"/>
+      <w:pPr>
+        <w:tabs>
+          <w:tab w:val="num" w:pos="6480"/>
+        </w:tabs>
+        <w:ind w:left="6480" w:hanging="360"/>
+      </w:pPr>
+      <w:rPr>
+        <w:rFonts w:ascii="Courier New" w:hAnsi="Courier New" w:hint="default"/>
+        <w:sz w:val="20"/>
+      </w:rPr>
+    </w:lvl>
+  </w:abstractNum>
+  <w:abstractNum w:abstractNumId="1" w15:restartNumberingAfterBreak="0">
+    <w:nsid w:val="05FB185B"/>
+    <w:multiLevelType w:val="hybridMultilevel"/>
+    <w:tmpl w:val="29504AD8"/>
+    <w:lvl w:ilvl="0" w:tplc="0C090001">
+      <w:start w:val="1"/>
+      <w:numFmt w:val="bullet"/>
+      <w:lvlText w:val=""/>
+      <w:lvlJc w:val="left"/>
+      <w:pPr>
+        <w:ind w:left="720" w:hanging="360"/>
+      </w:pPr>
+      <w:rPr>
+        <w:rFonts w:ascii="Symbol" w:hAnsi="Symbol" w:hint="default"/>
+      </w:rPr>
+    </w:lvl>
+    <w:lvl w:ilvl="1" w:tplc="0C090003" w:tentative="1">
+      <w:start w:val="1"/>
+      <w:numFmt w:val="bullet"/>
+      <w:lvlText w:val="o"/>
+      <w:lvlJc w:val="left"/>
+      <w:pPr>
+        <w:ind w:left="1440" w:hanging="360"/>
+      </w:pPr>
+      <w:rPr>
+        <w:rFonts w:ascii="Courier New" w:hAnsi="Courier New" w:cs="Courier New" w:hint="default"/>
+      </w:rPr>
+    </w:lvl>
+    <w:lvl w:ilvl="2" w:tplc="0C090005" w:tentative="1">
+      <w:start w:val="1"/>
+      <w:numFmt w:val="bullet"/>
+      <w:lvlText w:val=""/>
+      <w:lvlJc w:val="left"/>
+      <w:pPr>
+        <w:ind w:left="2160" w:hanging="360"/>
+      </w:pPr>
+      <w:rPr>
+        <w:rFonts w:ascii="Wingdings" w:hAnsi="Wingdings" w:hint="default"/>
+      </w:rPr>
+    </w:lvl>
+    <w:lvl w:ilvl="3" w:tplc="0C090001" w:tentative="1">
+      <w:start w:val="1"/>
+      <w:numFmt w:val="bullet"/>
+      <w:lvlText w:val=""/>
+      <w:lvlJc w:val="left"/>
+      <w:pPr>
+        <w:ind w:left="2880" w:hanging="360"/>
+      </w:pPr>
+      <w:rPr>
+        <w:rFonts w:ascii="Symbol" w:hAnsi="Symbol" w:hint="default"/>
+      </w:rPr>
+    </w:lvl>
+    <w:lvl w:ilvl="4" w:tplc="0C090003" w:tentative="1">
+      <w:start w:val="1"/>
+      <w:numFmt w:val="bullet"/>
+      <w:lvlText w:val="o"/>
+      <w:lvlJc w:val="left"/>
+      <w:pPr>
+        <w:ind w:left="3600" w:hanging="360"/>
+      </w:pPr>
+      <w:rPr>
+        <w:rFonts w:ascii="Courier New" w:hAnsi="Courier New" w:cs="Courier New" w:hint="default"/>
+      </w:rPr>
+    </w:lvl>
+    <w:lvl w:ilvl="5" w:tplc="0C090005" w:tentative="1">
+      <w:start w:val="1"/>
+      <w:numFmt w:val="bullet"/>
+      <w:lvlText w:val=""/>
+      <w:lvlJc w:val="left"/>
+      <w:pPr>
+        <w:ind w:left="4320" w:hanging="360"/>
+      </w:pPr>
+      <w:rPr>
+        <w:rFonts w:ascii="Wingdings" w:hAnsi="Wingdings" w:hint="default"/>
+      </w:rPr>
+    </w:lvl>
+    <w:lvl w:ilvl="6" w:tplc="0C090001" w:tentative="1">
+      <w:start w:val="1"/>
+      <w:numFmt w:val="bullet"/>
+      <w:lvlText w:val=""/>
+      <w:lvlJc w:val="left"/>
+      <w:pPr>
+        <w:ind w:left="5040" w:hanging="360"/>
+      </w:pPr>
+      <w:rPr>
+        <w:rFonts w:ascii="Symbol" w:hAnsi="Symbol" w:hint="default"/>
+      </w:rPr>
+    </w:lvl>
+    <w:lvl w:ilvl="7" w:tplc="0C090003" w:tentative="1">
+      <w:start w:val="1"/>
+      <w:numFmt w:val="bullet"/>
+      <w:lvlText w:val="o"/>
+      <w:lvlJc w:val="left"/>
+      <w:pPr>
+        <w:ind w:left="5760" w:hanging="360"/>
+      </w:pPr>
+      <w:rPr>
+        <w:rFonts w:ascii="Courier New" w:hAnsi="Courier New" w:cs="Courier New" w:hint="default"/>
+      </w:rPr>
+    </w:lvl>
+    <w:lvl w:ilvl="8" w:tplc="0C090005" w:tentative="1">
+      <w:start w:val="1"/>
+      <w:numFmt w:val="bullet"/>
+      <w:lvlText w:val=""/>
+      <w:lvlJc w:val="left"/>
+      <w:pPr>
+        <w:ind w:left="6480" w:hanging="360"/>
+      </w:pPr>
+      <w:rPr>
+        <w:rFonts w:ascii="Wingdings" w:hAnsi="Wingdings" w:hint="default"/>
+      </w:rPr>
+    </w:lvl>
+  </w:abstractNum>
+  <w:abstractNum w:abstractNumId="2" w15:restartNumberingAfterBreak="0">
+    <w:nsid w:val="065C1C12"/>
+    <w:multiLevelType w:val="multilevel"/>
+    <w:tmpl w:val="D752212A"/>
+    <w:lvl w:ilvl="0">
+      <w:start w:val="1"/>
+      <w:numFmt w:val="bullet"/>
+      <w:lvlText w:val=""/>
+      <w:lvlJc w:val="left"/>
+      <w:pPr>
+        <w:tabs>
+          <w:tab w:val="num" w:pos="720"/>
+        </w:tabs>
+        <w:ind w:left="720" w:hanging="360"/>
+      </w:pPr>
+      <w:rPr>
+        <w:rFonts w:ascii="Symbol" w:hAnsi="Symbol" w:hint="default"/>
+        <w:sz w:val="20"/>
+      </w:rPr>
+    </w:lvl>
+    <w:lvl w:ilvl="1">
+      <w:start w:val="1"/>
+      <w:numFmt w:val="bullet"/>
+      <w:lvlText w:val="o"/>
+      <w:lvlJc w:val="left"/>
+      <w:pPr>
+        <w:ind w:left="1440" w:hanging="360"/>
+      </w:pPr>
+      <w:rPr>
+        <w:rFonts w:ascii="Courier New" w:hAnsi="Courier New" w:cs="Courier New" w:hint="default"/>
+      </w:rPr>
+    </w:lvl>
+    <w:lvl w:ilvl="2" w:tentative="1">
+      <w:start w:val="1"/>
+      <w:numFmt w:val="bullet"/>
+      <w:lvlText w:val="o"/>
+      <w:lvlJc w:val="left"/>
+      <w:pPr>
+        <w:tabs>
+          <w:tab w:val="num" w:pos="2160"/>
+        </w:tabs>
+        <w:ind w:left="2160" w:hanging="360"/>
+      </w:pPr>
+      <w:rPr>
+        <w:rFonts w:ascii="Courier New" w:hAnsi="Courier New" w:hint="default"/>
+        <w:sz w:val="20"/>
+      </w:rPr>
+    </w:lvl>
+    <w:lvl w:ilvl="3" w:tentative="1">
+      <w:start w:val="1"/>
+      <w:numFmt w:val="bullet"/>
+      <w:lvlText w:val="o"/>
+      <w:lvlJc w:val="left"/>
+      <w:pPr>
+        <w:tabs>
+          <w:tab w:val="num" w:pos="2880"/>
+        </w:tabs>
+        <w:ind w:left="2880" w:hanging="360"/>
+      </w:pPr>
+      <w:rPr>
+        <w:rFonts w:ascii="Courier New" w:hAnsi="Courier New" w:hint="default"/>
+        <w:sz w:val="20"/>
+      </w:rPr>
+    </w:lvl>
+    <w:lvl w:ilvl="4" w:tentative="1">
+      <w:start w:val="1"/>
+      <w:numFmt w:val="bullet"/>
+      <w:lvlText w:val="o"/>
+      <w:lvlJc w:val="left"/>
+      <w:pPr>
+        <w:tabs>
+          <w:tab w:val="num" w:pos="3600"/>
+        </w:tabs>
+        <w:ind w:left="3600" w:hanging="360"/>
+      </w:pPr>
+      <w:rPr>
+        <w:rFonts w:ascii="Courier New" w:hAnsi="Courier New" w:hint="default"/>
+        <w:sz w:val="20"/>
+      </w:rPr>
+    </w:lvl>
+    <w:lvl w:ilvl="5" w:tentative="1">
+      <w:start w:val="1"/>
+      <w:numFmt w:val="bullet"/>
+      <w:lvlText w:val="o"/>
+      <w:lvlJc w:val="left"/>
+      <w:pPr>
+        <w:tabs>
+          <w:tab w:val="num" w:pos="4320"/>
+        </w:tabs>
+        <w:ind w:left="4320" w:hanging="360"/>
+      </w:pPr>
+      <w:rPr>
+        <w:rFonts w:ascii="Courier New" w:hAnsi="Courier New" w:hint="default"/>
+        <w:sz w:val="20"/>
+      </w:rPr>
+    </w:lvl>
+    <w:lvl w:ilvl="6" w:tentative="1">
+      <w:start w:val="1"/>
+      <w:numFmt w:val="bullet"/>
+      <w:lvlText w:val="o"/>
+      <w:lvlJc w:val="left"/>
+      <w:pPr>
+        <w:tabs>
+          <w:tab w:val="num" w:pos="5040"/>
+        </w:tabs>
+        <w:ind w:left="5040" w:hanging="360"/>
+      </w:pPr>
+      <w:rPr>
+        <w:rFonts w:ascii="Courier New" w:hAnsi="Courier New" w:hint="default"/>
+        <w:sz w:val="20"/>
+      </w:rPr>
+    </w:lvl>
+    <w:lvl w:ilvl="7" w:tentative="1">
+      <w:start w:val="1"/>
+      <w:numFmt w:val="bullet"/>
+      <w:lvlText w:val="o"/>
+      <w:lvlJc w:val="left"/>
+      <w:pPr>
+        <w:tabs>
+          <w:tab w:val="num" w:pos="5760"/>
+        </w:tabs>
+        <w:ind w:left="5760" w:hanging="360"/>
+      </w:pPr>
+      <w:rPr>
+        <w:rFonts w:ascii="Courier New" w:hAnsi="Courier New" w:hint="default"/>
+        <w:sz w:val="20"/>
+      </w:rPr>
+    </w:lvl>
+    <w:lvl w:ilvl="8" w:tentative="1">
+      <w:start w:val="1"/>
+      <w:numFmt w:val="bullet"/>
+      <w:lvlText w:val="o"/>
+      <w:lvlJc w:val="left"/>
+      <w:pPr>
+        <w:tabs>
+          <w:tab w:val="num" w:pos="6480"/>
+        </w:tabs>
+        <w:ind w:left="6480" w:hanging="360"/>
+      </w:pPr>
+      <w:rPr>
+        <w:rFonts w:ascii="Courier New" w:hAnsi="Courier New" w:hint="default"/>
+        <w:sz w:val="20"/>
+      </w:rPr>
+    </w:lvl>
+  </w:abstractNum>
+  <w:abstractNum w:abstractNumId="3" w15:restartNumberingAfterBreak="0">
+    <w:nsid w:val="0C967ED8"/>
+    <w:multiLevelType w:val="multilevel"/>
+    <w:tmpl w:val="D9288BC8"/>
+    <w:lvl w:ilvl="0">
+      <w:start w:val="1"/>
+      <w:numFmt w:val="bullet"/>
+      <w:lvlText w:val="o"/>
+      <w:lvlJc w:val="left"/>
+      <w:pPr>
+        <w:tabs>
+          <w:tab w:val="num" w:pos="720"/>
+        </w:tabs>
+        <w:ind w:left="720" w:hanging="360"/>
+      </w:pPr>
+      <w:rPr>
+        <w:rFonts w:ascii="Courier New" w:hAnsi="Courier New" w:hint="default"/>
+        <w:sz w:val="20"/>
+      </w:rPr>
+    </w:lvl>
+    <w:lvl w:ilvl="1" w:tentative="1">
+      <w:start w:val="1"/>
+      <w:numFmt w:val="bullet"/>
+      <w:lvlText w:val="o"/>
+      <w:lvlJc w:val="left"/>
+      <w:pPr>
+        <w:tabs>
+          <w:tab w:val="num" w:pos="1440"/>
+        </w:tabs>
+        <w:ind w:left="1440" w:hanging="360"/>
+      </w:pPr>
+      <w:rPr>
+        <w:rFonts w:ascii="Courier New" w:hAnsi="Courier New" w:hint="default"/>
+        <w:sz w:val="20"/>
+      </w:rPr>
+    </w:lvl>
+    <w:lvl w:ilvl="2" w:tentative="1">
+      <w:start w:val="1"/>
+      <w:numFmt w:val="bullet"/>
+      <w:lvlText w:val="o"/>
+      <w:lvlJc w:val="left"/>
+      <w:pPr>
+        <w:tabs>
+          <w:tab w:val="num" w:pos="2160"/>
+        </w:tabs>
+        <w:ind w:left="2160" w:hanging="360"/>
+      </w:pPr>
+      <w:rPr>
+        <w:rFonts w:ascii="Courier New" w:hAnsi="Courier New" w:hint="default"/>
+        <w:sz w:val="20"/>
+      </w:rPr>
+    </w:lvl>
+    <w:lvl w:ilvl="3" w:tentative="1">
+      <w:start w:val="1"/>
+      <w:numFmt w:val="bullet"/>
+      <w:lvlText w:val="o"/>
+      <w:lvlJc w:val="left"/>
+      <w:pPr>
+        <w:tabs>
+          <w:tab w:val="num" w:pos="2880"/>
+        </w:tabs>
+        <w:ind w:left="2880" w:hanging="360"/>
+      </w:pPr>
+      <w:rPr>
+        <w:rFonts w:ascii="Courier New" w:hAnsi="Courier New" w:hint="default"/>
+        <w:sz w:val="20"/>
+      </w:rPr>
+    </w:lvl>
+    <w:lvl w:ilvl="4" w:tentative="1">
+      <w:start w:val="1"/>
+      <w:numFmt w:val="bullet"/>
+      <w:lvlText w:val="o"/>
+      <w:lvlJc w:val="left"/>
+      <w:pPr>
+        <w:tabs>
+          <w:tab w:val="num" w:pos="3600"/>
+        </w:tabs>
+        <w:ind w:left="3600" w:hanging="360"/>
+      </w:pPr>
+      <w:rPr>
+        <w:rFonts w:ascii="Courier New" w:hAnsi="Courier New" w:hint="default"/>
+        <w:sz w:val="20"/>
+      </w:rPr>
+    </w:lvl>
+    <w:lvl w:ilvl="5" w:tentative="1">
+      <w:start w:val="1"/>
+      <w:numFmt w:val="bullet"/>
+      <w:lvlText w:val="o"/>
+      <w:lvlJc w:val="left"/>
+      <w:pPr>
+        <w:tabs>
+          <w:tab w:val="num" w:pos="4320"/>
+        </w:tabs>
+        <w:ind w:left="4320" w:hanging="360"/>
+      </w:pPr>
+      <w:rPr>
+        <w:rFonts w:ascii="Courier New" w:hAnsi="Courier New" w:hint="default"/>
+        <w:sz w:val="20"/>
+      </w:rPr>
+    </w:lvl>
+    <w:lvl w:ilvl="6" w:tentative="1">
+      <w:start w:val="1"/>
+      <w:numFmt w:val="bullet"/>
+      <w:lvlText w:val="o"/>
+      <w:lvlJc w:val="left"/>
+      <w:pPr>
+        <w:tabs>
+          <w:tab w:val="num" w:pos="5040"/>
+        </w:tabs>
+        <w:ind w:left="5040" w:hanging="360"/>
+      </w:pPr>
+      <w:rPr>
+        <w:rFonts w:ascii="Courier New" w:hAnsi="Courier New" w:hint="default"/>
+        <w:sz w:val="20"/>
+      </w:rPr>
+    </w:lvl>
+    <w:lvl w:ilvl="7" w:tentative="1">
+      <w:start w:val="1"/>
+      <w:numFmt w:val="bullet"/>
+      <w:lvlText w:val="o"/>
+      <w:lvlJc w:val="left"/>
+      <w:pPr>
+        <w:tabs>
+          <w:tab w:val="num" w:pos="5760"/>
+        </w:tabs>
+        <w:ind w:left="5760" w:hanging="360"/>
+      </w:pPr>
+      <w:rPr>
+        <w:rFonts w:ascii="Courier New" w:hAnsi="Courier New" w:hint="default"/>
+        <w:sz w:val="20"/>
+      </w:rPr>
+    </w:lvl>
+    <w:lvl w:ilvl="8" w:tentative="1">
+      <w:start w:val="1"/>
+      <w:numFmt w:val="bullet"/>
+      <w:lvlText w:val="o"/>
+      <w:lvlJc w:val="left"/>
+      <w:pPr>
+        <w:tabs>
+          <w:tab w:val="num" w:pos="6480"/>
+        </w:tabs>
+        <w:ind w:left="6480" w:hanging="360"/>
+      </w:pPr>
+      <w:rPr>
+        <w:rFonts w:ascii="Courier New" w:hAnsi="Courier New" w:hint="default"/>
+        <w:sz w:val="20"/>
+      </w:rPr>
+    </w:lvl>
+  </w:abstractNum>
+  <w:abstractNum w:abstractNumId="4" w15:restartNumberingAfterBreak="0">
+    <w:nsid w:val="25D7636F"/>
+    <w:multiLevelType w:val="hybridMultilevel"/>
+    <w:tmpl w:val="D1D08E54"/>
+    <w:lvl w:ilvl="0" w:tplc="0C090001">
+      <w:start w:val="1"/>
+      <w:numFmt w:val="bullet"/>
+      <w:lvlText w:val=""/>
+      <w:lvlJc w:val="left"/>
+      <w:pPr>
+        <w:ind w:left="720" w:hanging="360"/>
+      </w:pPr>
+      <w:rPr>
+        <w:rFonts w:ascii="Symbol" w:hAnsi="Symbol" w:hint="default"/>
+      </w:rPr>
+    </w:lvl>
+    <w:lvl w:ilvl="1" w:tplc="0C090003" w:tentative="1">
+      <w:start w:val="1"/>
+      <w:numFmt w:val="bullet"/>
+      <w:lvlText w:val="o"/>
+      <w:lvlJc w:val="left"/>
+      <w:pPr>
+        <w:ind w:left="1440" w:hanging="360"/>
+      </w:pPr>
+      <w:rPr>
+        <w:rFonts w:ascii="Courier New" w:hAnsi="Courier New" w:cs="Courier New" w:hint="default"/>
+      </w:rPr>
+    </w:lvl>
+    <w:lvl w:ilvl="2" w:tplc="0C090005" w:tentative="1">
+      <w:start w:val="1"/>
+      <w:numFmt w:val="bullet"/>
+      <w:lvlText w:val=""/>
+      <w:lvlJc w:val="left"/>
+      <w:pPr>
+        <w:ind w:left="2160" w:hanging="360"/>
+      </w:pPr>
+      <w:rPr>
+        <w:rFonts w:ascii="Wingdings" w:hAnsi="Wingdings" w:hint="default"/>
+      </w:rPr>
+    </w:lvl>
+    <w:lvl w:ilvl="3" w:tplc="0C090001" w:tentative="1">
+      <w:start w:val="1"/>
+      <w:numFmt w:val="bullet"/>
+      <w:lvlText w:val=""/>
+      <w:lvlJc w:val="left"/>
+      <w:pPr>
+        <w:ind w:left="2880" w:hanging="360"/>
+      </w:pPr>
+      <w:rPr>
+        <w:rFonts w:ascii="Symbol" w:hAnsi="Symbol" w:hint="default"/>
+      </w:rPr>
+    </w:lvl>
+    <w:lvl w:ilvl="4" w:tplc="0C090003" w:tentative="1">
+      <w:start w:val="1"/>
+      <w:numFmt w:val="bullet"/>
+      <w:lvlText w:val="o"/>
+      <w:lvlJc w:val="left"/>
+      <w:pPr>
+        <w:ind w:left="3600" w:hanging="360"/>
+      </w:pPr>
+      <w:rPr>
+        <w:rFonts w:ascii="Courier New" w:hAnsi="Courier New" w:cs="Courier New" w:hint="default"/>
+      </w:rPr>
+    </w:lvl>
+    <w:lvl w:ilvl="5" w:tplc="0C090005" w:tentative="1">
+      <w:start w:val="1"/>
+      <w:numFmt w:val="bullet"/>
+      <w:lvlText w:val=""/>
+      <w:lvlJc w:val="left"/>
+      <w:pPr>
+        <w:ind w:left="4320" w:hanging="360"/>
+      </w:pPr>
+      <w:rPr>
+        <w:rFonts w:ascii="Wingdings" w:hAnsi="Wingdings" w:hint="default"/>
+      </w:rPr>
+    </w:lvl>
+    <w:lvl w:ilvl="6" w:tplc="0C090001" w:tentative="1">
+      <w:start w:val="1"/>
+      <w:numFmt w:val="bullet"/>
+      <w:lvlText w:val=""/>
+      <w:lvlJc w:val="left"/>
+      <w:pPr>
+        <w:ind w:left="5040" w:hanging="360"/>
+      </w:pPr>
+      <w:rPr>
+        <w:rFonts w:ascii="Symbol" w:hAnsi="Symbol" w:hint="default"/>
+      </w:rPr>
+    </w:lvl>
+    <w:lvl w:ilvl="7" w:tplc="0C090003" w:tentative="1">
+      <w:start w:val="1"/>
+      <w:numFmt w:val="bullet"/>
+      <w:lvlText w:val="o"/>
+      <w:lvlJc w:val="left"/>
+      <w:pPr>
+        <w:ind w:left="5760" w:hanging="360"/>
+      </w:pPr>
+      <w:rPr>
+        <w:rFonts w:ascii="Courier New" w:hAnsi="Courier New" w:cs="Courier New" w:hint="default"/>
+      </w:rPr>
+    </w:lvl>
+    <w:lvl w:ilvl="8" w:tplc="0C090005" w:tentative="1">
+      <w:start w:val="1"/>
+      <w:numFmt w:val="bullet"/>
+      <w:lvlText w:val=""/>
+      <w:lvlJc w:val="left"/>
+      <w:pPr>
+        <w:ind w:left="6480" w:hanging="360"/>
+      </w:pPr>
+      <w:rPr>
+        <w:rFonts w:ascii="Wingdings" w:hAnsi="Wingdings" w:hint="default"/>
+      </w:rPr>
+    </w:lvl>
+  </w:abstractNum>
+  <w:abstractNum w:abstractNumId="5" w15:restartNumberingAfterBreak="0">
+    <w:nsid w:val="29DD4D2F"/>
+    <w:multiLevelType w:val="multilevel"/>
+    <w:tmpl w:val="9B9C47A6"/>
+    <w:lvl w:ilvl="0">
+      <w:start w:val="1"/>
+      <w:numFmt w:val="bullet"/>
+      <w:lvlText w:val="o"/>
+      <w:lvlJc w:val="left"/>
+      <w:pPr>
+        <w:tabs>
+          <w:tab w:val="num" w:pos="720"/>
+        </w:tabs>
+        <w:ind w:left="720" w:hanging="360"/>
+      </w:pPr>
+      <w:rPr>
+        <w:rFonts w:ascii="Courier New" w:hAnsi="Courier New" w:hint="default"/>
+        <w:sz w:val="20"/>
+      </w:rPr>
+    </w:lvl>
+    <w:lvl w:ilvl="1" w:tentative="1">
+      <w:start w:val="1"/>
+      <w:numFmt w:val="bullet"/>
+      <w:lvlText w:val="o"/>
+      <w:lvlJc w:val="left"/>
+      <w:pPr>
+        <w:tabs>
+          <w:tab w:val="num" w:pos="1440"/>
+        </w:tabs>
+        <w:ind w:left="1440" w:hanging="360"/>
+      </w:pPr>
+      <w:rPr>
+        <w:rFonts w:ascii="Courier New" w:hAnsi="Courier New" w:hint="default"/>
+        <w:sz w:val="20"/>
+      </w:rPr>
+    </w:lvl>
+    <w:lvl w:ilvl="2" w:tentative="1">
+      <w:start w:val="1"/>
+      <w:numFmt w:val="bullet"/>
+      <w:lvlText w:val="o"/>
+      <w:lvlJc w:val="left"/>
+      <w:pPr>
+        <w:tabs>
+          <w:tab w:val="num" w:pos="2160"/>
+        </w:tabs>
+        <w:ind w:left="2160" w:hanging="360"/>
+      </w:pPr>
+      <w:rPr>
+        <w:rFonts w:ascii="Courier New" w:hAnsi="Courier New" w:hint="default"/>
+        <w:sz w:val="20"/>
+      </w:rPr>
+    </w:lvl>
+    <w:lvl w:ilvl="3" w:tentative="1">
+      <w:start w:val="1"/>
+      <w:numFmt w:val="bullet"/>
+      <w:lvlText w:val="o"/>
+      <w:lvlJc w:val="left"/>
+      <w:pPr>
+        <w:tabs>
+          <w:tab w:val="num" w:pos="2880"/>
+        </w:tabs>
+        <w:ind w:left="2880" w:hanging="360"/>
+      </w:pPr>
+      <w:rPr>
+        <w:rFonts w:ascii="Courier New" w:hAnsi="Courier New" w:hint="default"/>
+        <w:sz w:val="20"/>
+      </w:rPr>
+    </w:lvl>
+    <w:lvl w:ilvl="4" w:tentative="1">
+      <w:start w:val="1"/>
+      <w:numFmt w:val="bullet"/>
+      <w:lvlText w:val="o"/>
+      <w:lvlJc w:val="left"/>
+      <w:pPr>
+        <w:tabs>
+          <w:tab w:val="num" w:pos="3600"/>
+        </w:tabs>
+        <w:ind w:left="3600" w:hanging="360"/>
+      </w:pPr>
+      <w:rPr>
+        <w:rFonts w:ascii="Courier New" w:hAnsi="Courier New" w:hint="default"/>
+        <w:sz w:val="20"/>
+      </w:rPr>
+    </w:lvl>
+    <w:lvl w:ilvl="5" w:tentative="1">
+      <w:start w:val="1"/>
+      <w:numFmt w:val="bullet"/>
+      <w:lvlText w:val="o"/>
+      <w:lvlJc w:val="left"/>
+      <w:pPr>
+        <w:tabs>
+          <w:tab w:val="num" w:pos="4320"/>
+        </w:tabs>
+        <w:ind w:left="4320" w:hanging="360"/>
+      </w:pPr>
+      <w:rPr>
+        <w:rFonts w:ascii="Courier New" w:hAnsi="Courier New" w:hint="default"/>
+        <w:sz w:val="20"/>
+      </w:rPr>
+    </w:lvl>
+    <w:lvl w:ilvl="6" w:tentative="1">
+      <w:start w:val="1"/>
+      <w:numFmt w:val="bullet"/>
+      <w:lvlText w:val="o"/>
+      <w:lvlJc w:val="left"/>
+      <w:pPr>
+        <w:tabs>
+          <w:tab w:val="num" w:pos="5040"/>
+        </w:tabs>
+        <w:ind w:left="5040" w:hanging="360"/>
+      </w:pPr>
+      <w:rPr>
+        <w:rFonts w:ascii="Courier New" w:hAnsi="Courier New" w:hint="default"/>
+        <w:sz w:val="20"/>
+      </w:rPr>
+    </w:lvl>
+    <w:lvl w:ilvl="7" w:tentative="1">
+      <w:start w:val="1"/>
+      <w:numFmt w:val="bullet"/>
+      <w:lvlText w:val="o"/>
+      <w:lvlJc w:val="left"/>
+      <w:pPr>
+        <w:tabs>
+          <w:tab w:val="num" w:pos="5760"/>
+        </w:tabs>
+        <w:ind w:left="5760" w:hanging="360"/>
+      </w:pPr>
+      <w:rPr>
+        <w:rFonts w:ascii="Courier New" w:hAnsi="Courier New" w:hint="default"/>
+        <w:sz w:val="20"/>
+      </w:rPr>
+    </w:lvl>
+    <w:lvl w:ilvl="8" w:tentative="1">
+      <w:start w:val="1"/>
+      <w:numFmt w:val="bullet"/>
+      <w:lvlText w:val="o"/>
+      <w:lvlJc w:val="left"/>
+      <w:pPr>
+        <w:tabs>
+          <w:tab w:val="num" w:pos="6480"/>
+        </w:tabs>
+        <w:ind w:left="6480" w:hanging="360"/>
+      </w:pPr>
+      <w:rPr>
+        <w:rFonts w:ascii="Courier New" w:hAnsi="Courier New" w:hint="default"/>
+        <w:sz w:val="20"/>
+      </w:rPr>
+    </w:lvl>
+  </w:abstractNum>
+  <w:abstractNum w:abstractNumId="6" w15:restartNumberingAfterBreak="0">
     <w:nsid w:val="36A46058"/>
     <w:multiLevelType w:val="hybridMultilevel"/>
     <w:tmpl w:val="A72A6140"/>
@@ -360,7 +3070,7 @@
       </w:rPr>
     </w:lvl>
   </w:abstractNum>
-  <w:abstractNum w:abstractNumId="1" w15:restartNumberingAfterBreak="0">
+  <w:abstractNum w:abstractNumId="7" w15:restartNumberingAfterBreak="0">
     <w:nsid w:val="3EAA32F8"/>
     <w:multiLevelType w:val="hybridMultilevel"/>
     <w:tmpl w:val="CBD8B3FA"/>
@@ -473,7 +3183,418 @@
       </w:rPr>
     </w:lvl>
   </w:abstractNum>
-  <w:abstractNum w:abstractNumId="2" w15:restartNumberingAfterBreak="0">
+  <w:abstractNum w:abstractNumId="8" w15:restartNumberingAfterBreak="0">
+    <w:nsid w:val="403A4424"/>
+    <w:multiLevelType w:val="hybridMultilevel"/>
+    <w:tmpl w:val="C004DE02"/>
+    <w:lvl w:ilvl="0" w:tplc="0C090001">
+      <w:start w:val="1"/>
+      <w:numFmt w:val="bullet"/>
+      <w:lvlText w:val=""/>
+      <w:lvlJc w:val="left"/>
+      <w:pPr>
+        <w:ind w:left="720" w:hanging="360"/>
+      </w:pPr>
+      <w:rPr>
+        <w:rFonts w:ascii="Symbol" w:hAnsi="Symbol" w:hint="default"/>
+      </w:rPr>
+    </w:lvl>
+    <w:lvl w:ilvl="1" w:tplc="0C090003">
+      <w:start w:val="1"/>
+      <w:numFmt w:val="bullet"/>
+      <w:lvlText w:val="o"/>
+      <w:lvlJc w:val="left"/>
+      <w:pPr>
+        <w:ind w:left="1440" w:hanging="360"/>
+      </w:pPr>
+      <w:rPr>
+        <w:rFonts w:ascii="Courier New" w:hAnsi="Courier New" w:cs="Courier New" w:hint="default"/>
+      </w:rPr>
+    </w:lvl>
+    <w:lvl w:ilvl="2" w:tplc="0C090005" w:tentative="1">
+      <w:start w:val="1"/>
+      <w:numFmt w:val="bullet"/>
+      <w:lvlText w:val=""/>
+      <w:lvlJc w:val="left"/>
+      <w:pPr>
+        <w:ind w:left="2160" w:hanging="360"/>
+      </w:pPr>
+      <w:rPr>
+        <w:rFonts w:ascii="Wingdings" w:hAnsi="Wingdings" w:hint="default"/>
+      </w:rPr>
+    </w:lvl>
+    <w:lvl w:ilvl="3" w:tplc="0C090001" w:tentative="1">
+      <w:start w:val="1"/>
+      <w:numFmt w:val="bullet"/>
+      <w:lvlText w:val=""/>
+      <w:lvlJc w:val="left"/>
+      <w:pPr>
+        <w:ind w:left="2880" w:hanging="360"/>
+      </w:pPr>
+      <w:rPr>
+        <w:rFonts w:ascii="Symbol" w:hAnsi="Symbol" w:hint="default"/>
+      </w:rPr>
+    </w:lvl>
+    <w:lvl w:ilvl="4" w:tplc="0C090003" w:tentative="1">
+      <w:start w:val="1"/>
+      <w:numFmt w:val="bullet"/>
+      <w:lvlText w:val="o"/>
+      <w:lvlJc w:val="left"/>
+      <w:pPr>
+        <w:ind w:left="3600" w:hanging="360"/>
+      </w:pPr>
+      <w:rPr>
+        <w:rFonts w:ascii="Courier New" w:hAnsi="Courier New" w:cs="Courier New" w:hint="default"/>
+      </w:rPr>
+    </w:lvl>
+    <w:lvl w:ilvl="5" w:tplc="0C090005" w:tentative="1">
+      <w:start w:val="1"/>
+      <w:numFmt w:val="bullet"/>
+      <w:lvlText w:val=""/>
+      <w:lvlJc w:val="left"/>
+      <w:pPr>
+        <w:ind w:left="4320" w:hanging="360"/>
+      </w:pPr>
+      <w:rPr>
+        <w:rFonts w:ascii="Wingdings" w:hAnsi="Wingdings" w:hint="default"/>
+      </w:rPr>
+    </w:lvl>
+    <w:lvl w:ilvl="6" w:tplc="0C090001" w:tentative="1">
+      <w:start w:val="1"/>
+      <w:numFmt w:val="bullet"/>
+      <w:lvlText w:val=""/>
+      <w:lvlJc w:val="left"/>
+      <w:pPr>
+        <w:ind w:left="5040" w:hanging="360"/>
+      </w:pPr>
+      <w:rPr>
+        <w:rFonts w:ascii="Symbol" w:hAnsi="Symbol" w:hint="default"/>
+      </w:rPr>
+    </w:lvl>
+    <w:lvl w:ilvl="7" w:tplc="0C090003" w:tentative="1">
+      <w:start w:val="1"/>
+      <w:numFmt w:val="bullet"/>
+      <w:lvlText w:val="o"/>
+      <w:lvlJc w:val="left"/>
+      <w:pPr>
+        <w:ind w:left="5760" w:hanging="360"/>
+      </w:pPr>
+      <w:rPr>
+        <w:rFonts w:ascii="Courier New" w:hAnsi="Courier New" w:cs="Courier New" w:hint="default"/>
+      </w:rPr>
+    </w:lvl>
+    <w:lvl w:ilvl="8" w:tplc="0C090005" w:tentative="1">
+      <w:start w:val="1"/>
+      <w:numFmt w:val="bullet"/>
+      <w:lvlText w:val=""/>
+      <w:lvlJc w:val="left"/>
+      <w:pPr>
+        <w:ind w:left="6480" w:hanging="360"/>
+      </w:pPr>
+      <w:rPr>
+        <w:rFonts w:ascii="Wingdings" w:hAnsi="Wingdings" w:hint="default"/>
+      </w:rPr>
+    </w:lvl>
+  </w:abstractNum>
+  <w:abstractNum w:abstractNumId="9" w15:restartNumberingAfterBreak="0">
+    <w:nsid w:val="42BF68AF"/>
+    <w:multiLevelType w:val="multilevel"/>
+    <w:tmpl w:val="AE1CE4F8"/>
+    <w:lvl w:ilvl="0">
+      <w:start w:val="1"/>
+      <w:numFmt w:val="bullet"/>
+      <w:lvlText w:val=""/>
+      <w:lvlJc w:val="left"/>
+      <w:pPr>
+        <w:tabs>
+          <w:tab w:val="num" w:pos="720"/>
+        </w:tabs>
+        <w:ind w:left="720" w:hanging="360"/>
+      </w:pPr>
+      <w:rPr>
+        <w:rFonts w:ascii="Symbol" w:hAnsi="Symbol" w:hint="default"/>
+        <w:sz w:val="20"/>
+      </w:rPr>
+    </w:lvl>
+    <w:lvl w:ilvl="1" w:tentative="1">
+      <w:start w:val="1"/>
+      <w:numFmt w:val="bullet"/>
+      <w:lvlText w:val=""/>
+      <w:lvlJc w:val="left"/>
+      <w:pPr>
+        <w:tabs>
+          <w:tab w:val="num" w:pos="1440"/>
+        </w:tabs>
+        <w:ind w:left="1440" w:hanging="360"/>
+      </w:pPr>
+      <w:rPr>
+        <w:rFonts w:ascii="Symbol" w:hAnsi="Symbol" w:hint="default"/>
+        <w:sz w:val="20"/>
+      </w:rPr>
+    </w:lvl>
+    <w:lvl w:ilvl="2" w:tentative="1">
+      <w:start w:val="1"/>
+      <w:numFmt w:val="bullet"/>
+      <w:lvlText w:val=""/>
+      <w:lvlJc w:val="left"/>
+      <w:pPr>
+        <w:tabs>
+          <w:tab w:val="num" w:pos="2160"/>
+        </w:tabs>
+        <w:ind w:left="2160" w:hanging="360"/>
+      </w:pPr>
+      <w:rPr>
+        <w:rFonts w:ascii="Symbol" w:hAnsi="Symbol" w:hint="default"/>
+        <w:sz w:val="20"/>
+      </w:rPr>
+    </w:lvl>
+    <w:lvl w:ilvl="3" w:tentative="1">
+      <w:start w:val="1"/>
+      <w:numFmt w:val="bullet"/>
+      <w:lvlText w:val=""/>
+      <w:lvlJc w:val="left"/>
+      <w:pPr>
+        <w:tabs>
+          <w:tab w:val="num" w:pos="2880"/>
+        </w:tabs>
+        <w:ind w:left="2880" w:hanging="360"/>
+      </w:pPr>
+      <w:rPr>
+        <w:rFonts w:ascii="Symbol" w:hAnsi="Symbol" w:hint="default"/>
+        <w:sz w:val="20"/>
+      </w:rPr>
+    </w:lvl>
+    <w:lvl w:ilvl="4" w:tentative="1">
+      <w:start w:val="1"/>
+      <w:numFmt w:val="bullet"/>
+      <w:lvlText w:val=""/>
+      <w:lvlJc w:val="left"/>
+      <w:pPr>
+        <w:tabs>
+          <w:tab w:val="num" w:pos="3600"/>
+        </w:tabs>
+        <w:ind w:left="3600" w:hanging="360"/>
+      </w:pPr>
+      <w:rPr>
+        <w:rFonts w:ascii="Symbol" w:hAnsi="Symbol" w:hint="default"/>
+        <w:sz w:val="20"/>
+      </w:rPr>
+    </w:lvl>
+    <w:lvl w:ilvl="5" w:tentative="1">
+      <w:start w:val="1"/>
+      <w:numFmt w:val="bullet"/>
+      <w:lvlText w:val=""/>
+      <w:lvlJc w:val="left"/>
+      <w:pPr>
+        <w:tabs>
+          <w:tab w:val="num" w:pos="4320"/>
+        </w:tabs>
+        <w:ind w:left="4320" w:hanging="360"/>
+      </w:pPr>
+      <w:rPr>
+        <w:rFonts w:ascii="Symbol" w:hAnsi="Symbol" w:hint="default"/>
+        <w:sz w:val="20"/>
+      </w:rPr>
+    </w:lvl>
+    <w:lvl w:ilvl="6" w:tentative="1">
+      <w:start w:val="1"/>
+      <w:numFmt w:val="bullet"/>
+      <w:lvlText w:val=""/>
+      <w:lvlJc w:val="left"/>
+      <w:pPr>
+        <w:tabs>
+          <w:tab w:val="num" w:pos="5040"/>
+        </w:tabs>
+        <w:ind w:left="5040" w:hanging="360"/>
+      </w:pPr>
+      <w:rPr>
+        <w:rFonts w:ascii="Symbol" w:hAnsi="Symbol" w:hint="default"/>
+        <w:sz w:val="20"/>
+      </w:rPr>
+    </w:lvl>
+    <w:lvl w:ilvl="7" w:tentative="1">
+      <w:start w:val="1"/>
+      <w:numFmt w:val="bullet"/>
+      <w:lvlText w:val=""/>
+      <w:lvlJc w:val="left"/>
+      <w:pPr>
+        <w:tabs>
+          <w:tab w:val="num" w:pos="5760"/>
+        </w:tabs>
+        <w:ind w:left="5760" w:hanging="360"/>
+      </w:pPr>
+      <w:rPr>
+        <w:rFonts w:ascii="Symbol" w:hAnsi="Symbol" w:hint="default"/>
+        <w:sz w:val="20"/>
+      </w:rPr>
+    </w:lvl>
+    <w:lvl w:ilvl="8" w:tentative="1">
+      <w:start w:val="1"/>
+      <w:numFmt w:val="bullet"/>
+      <w:lvlText w:val=""/>
+      <w:lvlJc w:val="left"/>
+      <w:pPr>
+        <w:tabs>
+          <w:tab w:val="num" w:pos="6480"/>
+        </w:tabs>
+        <w:ind w:left="6480" w:hanging="360"/>
+      </w:pPr>
+      <w:rPr>
+        <w:rFonts w:ascii="Symbol" w:hAnsi="Symbol" w:hint="default"/>
+        <w:sz w:val="20"/>
+      </w:rPr>
+    </w:lvl>
+  </w:abstractNum>
+  <w:abstractNum w:abstractNumId="10" w15:restartNumberingAfterBreak="0">
+    <w:nsid w:val="451904D9"/>
+    <w:multiLevelType w:val="multilevel"/>
+    <w:tmpl w:val="72884116"/>
+    <w:lvl w:ilvl="0">
+      <w:start w:val="1"/>
+      <w:numFmt w:val="bullet"/>
+      <w:lvlText w:val="o"/>
+      <w:lvlJc w:val="left"/>
+      <w:pPr>
+        <w:tabs>
+          <w:tab w:val="num" w:pos="720"/>
+        </w:tabs>
+        <w:ind w:left="720" w:hanging="360"/>
+      </w:pPr>
+      <w:rPr>
+        <w:rFonts w:ascii="Courier New" w:hAnsi="Courier New" w:hint="default"/>
+        <w:sz w:val="20"/>
+      </w:rPr>
+    </w:lvl>
+    <w:lvl w:ilvl="1" w:tentative="1">
+      <w:start w:val="1"/>
+      <w:numFmt w:val="bullet"/>
+      <w:lvlText w:val="o"/>
+      <w:lvlJc w:val="left"/>
+      <w:pPr>
+        <w:tabs>
+          <w:tab w:val="num" w:pos="1440"/>
+        </w:tabs>
+        <w:ind w:left="1440" w:hanging="360"/>
+      </w:pPr>
+      <w:rPr>
+        <w:rFonts w:ascii="Courier New" w:hAnsi="Courier New" w:hint="default"/>
+        <w:sz w:val="20"/>
+      </w:rPr>
+    </w:lvl>
+    <w:lvl w:ilvl="2" w:tentative="1">
+      <w:start w:val="1"/>
+      <w:numFmt w:val="bullet"/>
+      <w:lvlText w:val="o"/>
+      <w:lvlJc w:val="left"/>
+      <w:pPr>
+        <w:tabs>
+          <w:tab w:val="num" w:pos="2160"/>
+        </w:tabs>
+        <w:ind w:left="2160" w:hanging="360"/>
+      </w:pPr>
+      <w:rPr>
+        <w:rFonts w:ascii="Courier New" w:hAnsi="Courier New" w:hint="default"/>
+        <w:sz w:val="20"/>
+      </w:rPr>
+    </w:lvl>
+    <w:lvl w:ilvl="3" w:tentative="1">
+      <w:start w:val="1"/>
+      <w:numFmt w:val="bullet"/>
+      <w:lvlText w:val="o"/>
+      <w:lvlJc w:val="left"/>
+      <w:pPr>
+        <w:tabs>
+          <w:tab w:val="num" w:pos="2880"/>
+        </w:tabs>
+        <w:ind w:left="2880" w:hanging="360"/>
+      </w:pPr>
+      <w:rPr>
+        <w:rFonts w:ascii="Courier New" w:hAnsi="Courier New" w:hint="default"/>
+        <w:sz w:val="20"/>
+      </w:rPr>
+    </w:lvl>
+    <w:lvl w:ilvl="4" w:tentative="1">
+      <w:start w:val="1"/>
+      <w:numFmt w:val="bullet"/>
+      <w:lvlText w:val="o"/>
+      <w:lvlJc w:val="left"/>
+      <w:pPr>
+        <w:tabs>
+          <w:tab w:val="num" w:pos="3600"/>
+        </w:tabs>
+        <w:ind w:left="3600" w:hanging="360"/>
+      </w:pPr>
+      <w:rPr>
+        <w:rFonts w:ascii="Courier New" w:hAnsi="Courier New" w:hint="default"/>
+        <w:sz w:val="20"/>
+      </w:rPr>
+    </w:lvl>
+    <w:lvl w:ilvl="5" w:tentative="1">
+      <w:start w:val="1"/>
+      <w:numFmt w:val="bullet"/>
+      <w:lvlText w:val="o"/>
+      <w:lvlJc w:val="left"/>
+      <w:pPr>
+        <w:tabs>
+          <w:tab w:val="num" w:pos="4320"/>
+        </w:tabs>
+        <w:ind w:left="4320" w:hanging="360"/>
+      </w:pPr>
+      <w:rPr>
+        <w:rFonts w:ascii="Courier New" w:hAnsi="Courier New" w:hint="default"/>
+        <w:sz w:val="20"/>
+      </w:rPr>
+    </w:lvl>
+    <w:lvl w:ilvl="6" w:tentative="1">
+      <w:start w:val="1"/>
+      <w:numFmt w:val="bullet"/>
+      <w:lvlText w:val="o"/>
+      <w:lvlJc w:val="left"/>
+      <w:pPr>
+        <w:tabs>
+          <w:tab w:val="num" w:pos="5040"/>
+        </w:tabs>
+        <w:ind w:left="5040" w:hanging="360"/>
+      </w:pPr>
+      <w:rPr>
+        <w:rFonts w:ascii="Courier New" w:hAnsi="Courier New" w:hint="default"/>
+        <w:sz w:val="20"/>
+      </w:rPr>
+    </w:lvl>
+    <w:lvl w:ilvl="7" w:tentative="1">
+      <w:start w:val="1"/>
+      <w:numFmt w:val="bullet"/>
+      <w:lvlText w:val="o"/>
+      <w:lvlJc w:val="left"/>
+      <w:pPr>
+        <w:tabs>
+          <w:tab w:val="num" w:pos="5760"/>
+        </w:tabs>
+        <w:ind w:left="5760" w:hanging="360"/>
+      </w:pPr>
+      <w:rPr>
+        <w:rFonts w:ascii="Courier New" w:hAnsi="Courier New" w:hint="default"/>
+        <w:sz w:val="20"/>
+      </w:rPr>
+    </w:lvl>
+    <w:lvl w:ilvl="8" w:tentative="1">
+      <w:start w:val="1"/>
+      <w:numFmt w:val="bullet"/>
+      <w:lvlText w:val="o"/>
+      <w:lvlJc w:val="left"/>
+      <w:pPr>
+        <w:tabs>
+          <w:tab w:val="num" w:pos="6480"/>
+        </w:tabs>
+        <w:ind w:left="6480" w:hanging="360"/>
+      </w:pPr>
+      <w:rPr>
+        <w:rFonts w:ascii="Courier New" w:hAnsi="Courier New" w:hint="default"/>
+        <w:sz w:val="20"/>
+      </w:rPr>
+    </w:lvl>
+  </w:abstractNum>
+  <w:abstractNum w:abstractNumId="11" w15:restartNumberingAfterBreak="0">
     <w:nsid w:val="4E2B1746"/>
     <w:multiLevelType w:val="hybridMultilevel"/>
     <w:tmpl w:val="294A5D00"/>
@@ -562,7 +3683,156 @@
       </w:pPr>
     </w:lvl>
   </w:abstractNum>
-  <w:abstractNum w:abstractNumId="3" w15:restartNumberingAfterBreak="0">
+  <w:abstractNum w:abstractNumId="12" w15:restartNumberingAfterBreak="0">
+    <w:nsid w:val="523C008C"/>
+    <w:multiLevelType w:val="multilevel"/>
+    <w:tmpl w:val="7466EEEC"/>
+    <w:lvl w:ilvl="0">
+      <w:start w:val="1"/>
+      <w:numFmt w:val="bullet"/>
+      <w:lvlText w:val="o"/>
+      <w:lvlJc w:val="left"/>
+      <w:pPr>
+        <w:tabs>
+          <w:tab w:val="num" w:pos="720"/>
+        </w:tabs>
+        <w:ind w:left="720" w:hanging="360"/>
+      </w:pPr>
+      <w:rPr>
+        <w:rFonts w:ascii="Courier New" w:hAnsi="Courier New" w:hint="default"/>
+        <w:sz w:val="20"/>
+      </w:rPr>
+    </w:lvl>
+    <w:lvl w:ilvl="1">
+      <w:start w:val="1"/>
+      <w:numFmt w:val="bullet"/>
+      <w:lvlText w:val=""/>
+      <w:lvlJc w:val="left"/>
+      <w:pPr>
+        <w:tabs>
+          <w:tab w:val="num" w:pos="1440"/>
+        </w:tabs>
+        <w:ind w:left="1440" w:hanging="360"/>
+      </w:pPr>
+      <w:rPr>
+        <w:rFonts w:ascii="Symbol" w:hAnsi="Symbol" w:hint="default"/>
+        <w:sz w:val="20"/>
+      </w:rPr>
+    </w:lvl>
+    <w:lvl w:ilvl="2" w:tentative="1">
+      <w:start w:val="1"/>
+      <w:numFmt w:val="bullet"/>
+      <w:lvlText w:val="o"/>
+      <w:lvlJc w:val="left"/>
+      <w:pPr>
+        <w:tabs>
+          <w:tab w:val="num" w:pos="2160"/>
+        </w:tabs>
+        <w:ind w:left="2160" w:hanging="360"/>
+      </w:pPr>
+      <w:rPr>
+        <w:rFonts w:ascii="Courier New" w:hAnsi="Courier New" w:hint="default"/>
+        <w:sz w:val="20"/>
+      </w:rPr>
+    </w:lvl>
+    <w:lvl w:ilvl="3" w:tentative="1">
+      <w:start w:val="1"/>
+      <w:numFmt w:val="bullet"/>
+      <w:lvlText w:val="o"/>
+      <w:lvlJc w:val="left"/>
+      <w:pPr>
+        <w:tabs>
+          <w:tab w:val="num" w:pos="2880"/>
+        </w:tabs>
+        <w:ind w:left="2880" w:hanging="360"/>
+      </w:pPr>
+      <w:rPr>
+        <w:rFonts w:ascii="Courier New" w:hAnsi="Courier New" w:hint="default"/>
+        <w:sz w:val="20"/>
+      </w:rPr>
+    </w:lvl>
+    <w:lvl w:ilvl="4" w:tentative="1">
+      <w:start w:val="1"/>
+      <w:numFmt w:val="bullet"/>
+      <w:lvlText w:val="o"/>
+      <w:lvlJc w:val="left"/>
+      <w:pPr>
+        <w:tabs>
+          <w:tab w:val="num" w:pos="3600"/>
+        </w:tabs>
+        <w:ind w:left="3600" w:hanging="360"/>
+      </w:pPr>
+      <w:rPr>
+        <w:rFonts w:ascii="Courier New" w:hAnsi="Courier New" w:hint="default"/>
+        <w:sz w:val="20"/>
+      </w:rPr>
+    </w:lvl>
+    <w:lvl w:ilvl="5" w:tentative="1">
+      <w:start w:val="1"/>
+      <w:numFmt w:val="bullet"/>
+      <w:lvlText w:val="o"/>
+      <w:lvlJc w:val="left"/>
+      <w:pPr>
+        <w:tabs>
+          <w:tab w:val="num" w:pos="4320"/>
+        </w:tabs>
+        <w:ind w:left="4320" w:hanging="360"/>
+      </w:pPr>
+      <w:rPr>
+        <w:rFonts w:ascii="Courier New" w:hAnsi="Courier New" w:hint="default"/>
+        <w:sz w:val="20"/>
+      </w:rPr>
+    </w:lvl>
+    <w:lvl w:ilvl="6" w:tentative="1">
+      <w:start w:val="1"/>
+      <w:numFmt w:val="bullet"/>
+      <w:lvlText w:val="o"/>
+      <w:lvlJc w:val="left"/>
+      <w:pPr>
+        <w:tabs>
+          <w:tab w:val="num" w:pos="5040"/>
+        </w:tabs>
+        <w:ind w:left="5040" w:hanging="360"/>
+      </w:pPr>
+      <w:rPr>
+        <w:rFonts w:ascii="Courier New" w:hAnsi="Courier New" w:hint="default"/>
+        <w:sz w:val="20"/>
+      </w:rPr>
+    </w:lvl>
+    <w:lvl w:ilvl="7" w:tentative="1">
+      <w:start w:val="1"/>
+      <w:numFmt w:val="bullet"/>
+      <w:lvlText w:val="o"/>
+      <w:lvlJc w:val="left"/>
+      <w:pPr>
+        <w:tabs>
+          <w:tab w:val="num" w:pos="5760"/>
+        </w:tabs>
+        <w:ind w:left="5760" w:hanging="360"/>
+      </w:pPr>
+      <w:rPr>
+        <w:rFonts w:ascii="Courier New" w:hAnsi="Courier New" w:hint="default"/>
+        <w:sz w:val="20"/>
+      </w:rPr>
+    </w:lvl>
+    <w:lvl w:ilvl="8" w:tentative="1">
+      <w:start w:val="1"/>
+      <w:numFmt w:val="bullet"/>
+      <w:lvlText w:val="o"/>
+      <w:lvlJc w:val="left"/>
+      <w:pPr>
+        <w:tabs>
+          <w:tab w:val="num" w:pos="6480"/>
+        </w:tabs>
+        <w:ind w:left="6480" w:hanging="360"/>
+      </w:pPr>
+      <w:rPr>
+        <w:rFonts w:ascii="Courier New" w:hAnsi="Courier New" w:hint="default"/>
+        <w:sz w:val="20"/>
+      </w:rPr>
+    </w:lvl>
+  </w:abstractNum>
+  <w:abstractNum w:abstractNumId="13" w15:restartNumberingAfterBreak="0">
     <w:nsid w:val="5257281D"/>
     <w:multiLevelType w:val="hybridMultilevel"/>
     <w:tmpl w:val="1E562AD2"/>
@@ -675,17 +3945,767 @@
       </w:rPr>
     </w:lvl>
   </w:abstractNum>
+  <w:abstractNum w:abstractNumId="14" w15:restartNumberingAfterBreak="0">
+    <w:nsid w:val="5898174D"/>
+    <w:multiLevelType w:val="multilevel"/>
+    <w:tmpl w:val="888A88D4"/>
+    <w:lvl w:ilvl="0">
+      <w:start w:val="1"/>
+      <w:numFmt w:val="bullet"/>
+      <w:lvlText w:val=""/>
+      <w:lvlJc w:val="left"/>
+      <w:pPr>
+        <w:tabs>
+          <w:tab w:val="num" w:pos="720"/>
+        </w:tabs>
+        <w:ind w:left="720" w:hanging="360"/>
+      </w:pPr>
+      <w:rPr>
+        <w:rFonts w:ascii="Symbol" w:hAnsi="Symbol" w:hint="default"/>
+        <w:sz w:val="20"/>
+      </w:rPr>
+    </w:lvl>
+    <w:lvl w:ilvl="1">
+      <w:start w:val="1"/>
+      <w:numFmt w:val="bullet"/>
+      <w:lvlText w:val=""/>
+      <w:lvlJc w:val="left"/>
+      <w:pPr>
+        <w:tabs>
+          <w:tab w:val="num" w:pos="1440"/>
+        </w:tabs>
+        <w:ind w:left="1440" w:hanging="360"/>
+      </w:pPr>
+      <w:rPr>
+        <w:rFonts w:ascii="Symbol" w:hAnsi="Symbol" w:hint="default"/>
+        <w:sz w:val="20"/>
+      </w:rPr>
+    </w:lvl>
+    <w:lvl w:ilvl="2" w:tentative="1">
+      <w:start w:val="1"/>
+      <w:numFmt w:val="bullet"/>
+      <w:lvlText w:val="o"/>
+      <w:lvlJc w:val="left"/>
+      <w:pPr>
+        <w:tabs>
+          <w:tab w:val="num" w:pos="2160"/>
+        </w:tabs>
+        <w:ind w:left="2160" w:hanging="360"/>
+      </w:pPr>
+      <w:rPr>
+        <w:rFonts w:ascii="Courier New" w:hAnsi="Courier New" w:hint="default"/>
+        <w:sz w:val="20"/>
+      </w:rPr>
+    </w:lvl>
+    <w:lvl w:ilvl="3" w:tentative="1">
+      <w:start w:val="1"/>
+      <w:numFmt w:val="bullet"/>
+      <w:lvlText w:val="o"/>
+      <w:lvlJc w:val="left"/>
+      <w:pPr>
+        <w:tabs>
+          <w:tab w:val="num" w:pos="2880"/>
+        </w:tabs>
+        <w:ind w:left="2880" w:hanging="360"/>
+      </w:pPr>
+      <w:rPr>
+        <w:rFonts w:ascii="Courier New" w:hAnsi="Courier New" w:hint="default"/>
+        <w:sz w:val="20"/>
+      </w:rPr>
+    </w:lvl>
+    <w:lvl w:ilvl="4" w:tentative="1">
+      <w:start w:val="1"/>
+      <w:numFmt w:val="bullet"/>
+      <w:lvlText w:val="o"/>
+      <w:lvlJc w:val="left"/>
+      <w:pPr>
+        <w:tabs>
+          <w:tab w:val="num" w:pos="3600"/>
+        </w:tabs>
+        <w:ind w:left="3600" w:hanging="360"/>
+      </w:pPr>
+      <w:rPr>
+        <w:rFonts w:ascii="Courier New" w:hAnsi="Courier New" w:hint="default"/>
+        <w:sz w:val="20"/>
+      </w:rPr>
+    </w:lvl>
+    <w:lvl w:ilvl="5" w:tentative="1">
+      <w:start w:val="1"/>
+      <w:numFmt w:val="bullet"/>
+      <w:lvlText w:val="o"/>
+      <w:lvlJc w:val="left"/>
+      <w:pPr>
+        <w:tabs>
+          <w:tab w:val="num" w:pos="4320"/>
+        </w:tabs>
+        <w:ind w:left="4320" w:hanging="360"/>
+      </w:pPr>
+      <w:rPr>
+        <w:rFonts w:ascii="Courier New" w:hAnsi="Courier New" w:hint="default"/>
+        <w:sz w:val="20"/>
+      </w:rPr>
+    </w:lvl>
+    <w:lvl w:ilvl="6" w:tentative="1">
+      <w:start w:val="1"/>
+      <w:numFmt w:val="bullet"/>
+      <w:lvlText w:val="o"/>
+      <w:lvlJc w:val="left"/>
+      <w:pPr>
+        <w:tabs>
+          <w:tab w:val="num" w:pos="5040"/>
+        </w:tabs>
+        <w:ind w:left="5040" w:hanging="360"/>
+      </w:pPr>
+      <w:rPr>
+        <w:rFonts w:ascii="Courier New" w:hAnsi="Courier New" w:hint="default"/>
+        <w:sz w:val="20"/>
+      </w:rPr>
+    </w:lvl>
+    <w:lvl w:ilvl="7" w:tentative="1">
+      <w:start w:val="1"/>
+      <w:numFmt w:val="bullet"/>
+      <w:lvlText w:val="o"/>
+      <w:lvlJc w:val="left"/>
+      <w:pPr>
+        <w:tabs>
+          <w:tab w:val="num" w:pos="5760"/>
+        </w:tabs>
+        <w:ind w:left="5760" w:hanging="360"/>
+      </w:pPr>
+      <w:rPr>
+        <w:rFonts w:ascii="Courier New" w:hAnsi="Courier New" w:hint="default"/>
+        <w:sz w:val="20"/>
+      </w:rPr>
+    </w:lvl>
+    <w:lvl w:ilvl="8" w:tentative="1">
+      <w:start w:val="1"/>
+      <w:numFmt w:val="bullet"/>
+      <w:lvlText w:val="o"/>
+      <w:lvlJc w:val="left"/>
+      <w:pPr>
+        <w:tabs>
+          <w:tab w:val="num" w:pos="6480"/>
+        </w:tabs>
+        <w:ind w:left="6480" w:hanging="360"/>
+      </w:pPr>
+      <w:rPr>
+        <w:rFonts w:ascii="Courier New" w:hAnsi="Courier New" w:hint="default"/>
+        <w:sz w:val="20"/>
+      </w:rPr>
+    </w:lvl>
+  </w:abstractNum>
+  <w:abstractNum w:abstractNumId="15" w15:restartNumberingAfterBreak="0">
+    <w:nsid w:val="5F311CE4"/>
+    <w:multiLevelType w:val="multilevel"/>
+    <w:tmpl w:val="1D3C111C"/>
+    <w:lvl w:ilvl="0">
+      <w:start w:val="1"/>
+      <w:numFmt w:val="bullet"/>
+      <w:lvlText w:val="o"/>
+      <w:lvlJc w:val="left"/>
+      <w:pPr>
+        <w:tabs>
+          <w:tab w:val="num" w:pos="720"/>
+        </w:tabs>
+        <w:ind w:left="720" w:hanging="360"/>
+      </w:pPr>
+      <w:rPr>
+        <w:rFonts w:ascii="Courier New" w:hAnsi="Courier New" w:hint="default"/>
+        <w:sz w:val="20"/>
+      </w:rPr>
+    </w:lvl>
+    <w:lvl w:ilvl="1" w:tentative="1">
+      <w:start w:val="1"/>
+      <w:numFmt w:val="bullet"/>
+      <w:lvlText w:val="o"/>
+      <w:lvlJc w:val="left"/>
+      <w:pPr>
+        <w:tabs>
+          <w:tab w:val="num" w:pos="1440"/>
+        </w:tabs>
+        <w:ind w:left="1440" w:hanging="360"/>
+      </w:pPr>
+      <w:rPr>
+        <w:rFonts w:ascii="Courier New" w:hAnsi="Courier New" w:hint="default"/>
+        <w:sz w:val="20"/>
+      </w:rPr>
+    </w:lvl>
+    <w:lvl w:ilvl="2" w:tentative="1">
+      <w:start w:val="1"/>
+      <w:numFmt w:val="bullet"/>
+      <w:lvlText w:val="o"/>
+      <w:lvlJc w:val="left"/>
+      <w:pPr>
+        <w:tabs>
+          <w:tab w:val="num" w:pos="2160"/>
+        </w:tabs>
+        <w:ind w:left="2160" w:hanging="360"/>
+      </w:pPr>
+      <w:rPr>
+        <w:rFonts w:ascii="Courier New" w:hAnsi="Courier New" w:hint="default"/>
+        <w:sz w:val="20"/>
+      </w:rPr>
+    </w:lvl>
+    <w:lvl w:ilvl="3" w:tentative="1">
+      <w:start w:val="1"/>
+      <w:numFmt w:val="bullet"/>
+      <w:lvlText w:val="o"/>
+      <w:lvlJc w:val="left"/>
+      <w:pPr>
+        <w:tabs>
+          <w:tab w:val="num" w:pos="2880"/>
+        </w:tabs>
+        <w:ind w:left="2880" w:hanging="360"/>
+      </w:pPr>
+      <w:rPr>
+        <w:rFonts w:ascii="Courier New" w:hAnsi="Courier New" w:hint="default"/>
+        <w:sz w:val="20"/>
+      </w:rPr>
+    </w:lvl>
+    <w:lvl w:ilvl="4" w:tentative="1">
+      <w:start w:val="1"/>
+      <w:numFmt w:val="bullet"/>
+      <w:lvlText w:val="o"/>
+      <w:lvlJc w:val="left"/>
+      <w:pPr>
+        <w:tabs>
+          <w:tab w:val="num" w:pos="3600"/>
+        </w:tabs>
+        <w:ind w:left="3600" w:hanging="360"/>
+      </w:pPr>
+      <w:rPr>
+        <w:rFonts w:ascii="Courier New" w:hAnsi="Courier New" w:hint="default"/>
+        <w:sz w:val="20"/>
+      </w:rPr>
+    </w:lvl>
+    <w:lvl w:ilvl="5" w:tentative="1">
+      <w:start w:val="1"/>
+      <w:numFmt w:val="bullet"/>
+      <w:lvlText w:val="o"/>
+      <w:lvlJc w:val="left"/>
+      <w:pPr>
+        <w:tabs>
+          <w:tab w:val="num" w:pos="4320"/>
+        </w:tabs>
+        <w:ind w:left="4320" w:hanging="360"/>
+      </w:pPr>
+      <w:rPr>
+        <w:rFonts w:ascii="Courier New" w:hAnsi="Courier New" w:hint="default"/>
+        <w:sz w:val="20"/>
+      </w:rPr>
+    </w:lvl>
+    <w:lvl w:ilvl="6" w:tentative="1">
+      <w:start w:val="1"/>
+      <w:numFmt w:val="bullet"/>
+      <w:lvlText w:val="o"/>
+      <w:lvlJc w:val="left"/>
+      <w:pPr>
+        <w:tabs>
+          <w:tab w:val="num" w:pos="5040"/>
+        </w:tabs>
+        <w:ind w:left="5040" w:hanging="360"/>
+      </w:pPr>
+      <w:rPr>
+        <w:rFonts w:ascii="Courier New" w:hAnsi="Courier New" w:hint="default"/>
+        <w:sz w:val="20"/>
+      </w:rPr>
+    </w:lvl>
+    <w:lvl w:ilvl="7" w:tentative="1">
+      <w:start w:val="1"/>
+      <w:numFmt w:val="bullet"/>
+      <w:lvlText w:val="o"/>
+      <w:lvlJc w:val="left"/>
+      <w:pPr>
+        <w:tabs>
+          <w:tab w:val="num" w:pos="5760"/>
+        </w:tabs>
+        <w:ind w:left="5760" w:hanging="360"/>
+      </w:pPr>
+      <w:rPr>
+        <w:rFonts w:ascii="Courier New" w:hAnsi="Courier New" w:hint="default"/>
+        <w:sz w:val="20"/>
+      </w:rPr>
+    </w:lvl>
+    <w:lvl w:ilvl="8" w:tentative="1">
+      <w:start w:val="1"/>
+      <w:numFmt w:val="bullet"/>
+      <w:lvlText w:val="o"/>
+      <w:lvlJc w:val="left"/>
+      <w:pPr>
+        <w:tabs>
+          <w:tab w:val="num" w:pos="6480"/>
+        </w:tabs>
+        <w:ind w:left="6480" w:hanging="360"/>
+      </w:pPr>
+      <w:rPr>
+        <w:rFonts w:ascii="Courier New" w:hAnsi="Courier New" w:hint="default"/>
+        <w:sz w:val="20"/>
+      </w:rPr>
+    </w:lvl>
+  </w:abstractNum>
+  <w:abstractNum w:abstractNumId="16" w15:restartNumberingAfterBreak="0">
+    <w:nsid w:val="649B6934"/>
+    <w:multiLevelType w:val="multilevel"/>
+    <w:tmpl w:val="19E4C950"/>
+    <w:lvl w:ilvl="0">
+      <w:start w:val="1"/>
+      <w:numFmt w:val="bullet"/>
+      <w:lvlText w:val="o"/>
+      <w:lvlJc w:val="left"/>
+      <w:pPr>
+        <w:tabs>
+          <w:tab w:val="num" w:pos="720"/>
+        </w:tabs>
+        <w:ind w:left="720" w:hanging="360"/>
+      </w:pPr>
+      <w:rPr>
+        <w:rFonts w:ascii="Courier New" w:hAnsi="Courier New" w:hint="default"/>
+        <w:sz w:val="20"/>
+      </w:rPr>
+    </w:lvl>
+    <w:lvl w:ilvl="1">
+      <w:start w:val="1"/>
+      <w:numFmt w:val="bullet"/>
+      <w:lvlText w:val="o"/>
+      <w:lvlJc w:val="left"/>
+      <w:pPr>
+        <w:ind w:left="1440" w:hanging="360"/>
+      </w:pPr>
+      <w:rPr>
+        <w:rFonts w:ascii="Courier New" w:hAnsi="Courier New" w:cs="Courier New" w:hint="default"/>
+      </w:rPr>
+    </w:lvl>
+    <w:lvl w:ilvl="2" w:tentative="1">
+      <w:start w:val="1"/>
+      <w:numFmt w:val="bullet"/>
+      <w:lvlText w:val="o"/>
+      <w:lvlJc w:val="left"/>
+      <w:pPr>
+        <w:tabs>
+          <w:tab w:val="num" w:pos="2160"/>
+        </w:tabs>
+        <w:ind w:left="2160" w:hanging="360"/>
+      </w:pPr>
+      <w:rPr>
+        <w:rFonts w:ascii="Courier New" w:hAnsi="Courier New" w:hint="default"/>
+        <w:sz w:val="20"/>
+      </w:rPr>
+    </w:lvl>
+    <w:lvl w:ilvl="3" w:tentative="1">
+      <w:start w:val="1"/>
+      <w:numFmt w:val="bullet"/>
+      <w:lvlText w:val="o"/>
+      <w:lvlJc w:val="left"/>
+      <w:pPr>
+        <w:tabs>
+          <w:tab w:val="num" w:pos="2880"/>
+        </w:tabs>
+        <w:ind w:left="2880" w:hanging="360"/>
+      </w:pPr>
+      <w:rPr>
+        <w:rFonts w:ascii="Courier New" w:hAnsi="Courier New" w:hint="default"/>
+        <w:sz w:val="20"/>
+      </w:rPr>
+    </w:lvl>
+    <w:lvl w:ilvl="4" w:tentative="1">
+      <w:start w:val="1"/>
+      <w:numFmt w:val="bullet"/>
+      <w:lvlText w:val="o"/>
+      <w:lvlJc w:val="left"/>
+      <w:pPr>
+        <w:tabs>
+          <w:tab w:val="num" w:pos="3600"/>
+        </w:tabs>
+        <w:ind w:left="3600" w:hanging="360"/>
+      </w:pPr>
+      <w:rPr>
+        <w:rFonts w:ascii="Courier New" w:hAnsi="Courier New" w:hint="default"/>
+        <w:sz w:val="20"/>
+      </w:rPr>
+    </w:lvl>
+    <w:lvl w:ilvl="5" w:tentative="1">
+      <w:start w:val="1"/>
+      <w:numFmt w:val="bullet"/>
+      <w:lvlText w:val="o"/>
+      <w:lvlJc w:val="left"/>
+      <w:pPr>
+        <w:tabs>
+          <w:tab w:val="num" w:pos="4320"/>
+        </w:tabs>
+        <w:ind w:left="4320" w:hanging="360"/>
+      </w:pPr>
+      <w:rPr>
+        <w:rFonts w:ascii="Courier New" w:hAnsi="Courier New" w:hint="default"/>
+        <w:sz w:val="20"/>
+      </w:rPr>
+    </w:lvl>
+    <w:lvl w:ilvl="6" w:tentative="1">
+      <w:start w:val="1"/>
+      <w:numFmt w:val="bullet"/>
+      <w:lvlText w:val="o"/>
+      <w:lvlJc w:val="left"/>
+      <w:pPr>
+        <w:tabs>
+          <w:tab w:val="num" w:pos="5040"/>
+        </w:tabs>
+        <w:ind w:left="5040" w:hanging="360"/>
+      </w:pPr>
+      <w:rPr>
+        <w:rFonts w:ascii="Courier New" w:hAnsi="Courier New" w:hint="default"/>
+        <w:sz w:val="20"/>
+      </w:rPr>
+    </w:lvl>
+    <w:lvl w:ilvl="7" w:tentative="1">
+      <w:start w:val="1"/>
+      <w:numFmt w:val="bullet"/>
+      <w:lvlText w:val="o"/>
+      <w:lvlJc w:val="left"/>
+      <w:pPr>
+        <w:tabs>
+          <w:tab w:val="num" w:pos="5760"/>
+        </w:tabs>
+        <w:ind w:left="5760" w:hanging="360"/>
+      </w:pPr>
+      <w:rPr>
+        <w:rFonts w:ascii="Courier New" w:hAnsi="Courier New" w:hint="default"/>
+        <w:sz w:val="20"/>
+      </w:rPr>
+    </w:lvl>
+    <w:lvl w:ilvl="8" w:tentative="1">
+      <w:start w:val="1"/>
+      <w:numFmt w:val="bullet"/>
+      <w:lvlText w:val="o"/>
+      <w:lvlJc w:val="left"/>
+      <w:pPr>
+        <w:tabs>
+          <w:tab w:val="num" w:pos="6480"/>
+        </w:tabs>
+        <w:ind w:left="6480" w:hanging="360"/>
+      </w:pPr>
+      <w:rPr>
+        <w:rFonts w:ascii="Courier New" w:hAnsi="Courier New" w:hint="default"/>
+        <w:sz w:val="20"/>
+      </w:rPr>
+    </w:lvl>
+  </w:abstractNum>
+  <w:abstractNum w:abstractNumId="17" w15:restartNumberingAfterBreak="0">
+    <w:nsid w:val="65025992"/>
+    <w:multiLevelType w:val="hybridMultilevel"/>
+    <w:tmpl w:val="E2521388"/>
+    <w:lvl w:ilvl="0" w:tplc="0C090001">
+      <w:start w:val="1"/>
+      <w:numFmt w:val="bullet"/>
+      <w:lvlText w:val=""/>
+      <w:lvlJc w:val="left"/>
+      <w:pPr>
+        <w:ind w:left="720" w:hanging="360"/>
+      </w:pPr>
+      <w:rPr>
+        <w:rFonts w:ascii="Symbol" w:hAnsi="Symbol" w:hint="default"/>
+      </w:rPr>
+    </w:lvl>
+    <w:lvl w:ilvl="1" w:tplc="0C090003" w:tentative="1">
+      <w:start w:val="1"/>
+      <w:numFmt w:val="bullet"/>
+      <w:lvlText w:val="o"/>
+      <w:lvlJc w:val="left"/>
+      <w:pPr>
+        <w:ind w:left="1440" w:hanging="360"/>
+      </w:pPr>
+      <w:rPr>
+        <w:rFonts w:ascii="Courier New" w:hAnsi="Courier New" w:cs="Courier New" w:hint="default"/>
+      </w:rPr>
+    </w:lvl>
+    <w:lvl w:ilvl="2" w:tplc="0C090005" w:tentative="1">
+      <w:start w:val="1"/>
+      <w:numFmt w:val="bullet"/>
+      <w:lvlText w:val=""/>
+      <w:lvlJc w:val="left"/>
+      <w:pPr>
+        <w:ind w:left="2160" w:hanging="360"/>
+      </w:pPr>
+      <w:rPr>
+        <w:rFonts w:ascii="Wingdings" w:hAnsi="Wingdings" w:hint="default"/>
+      </w:rPr>
+    </w:lvl>
+    <w:lvl w:ilvl="3" w:tplc="0C090001" w:tentative="1">
+      <w:start w:val="1"/>
+      <w:numFmt w:val="bullet"/>
+      <w:lvlText w:val=""/>
+      <w:lvlJc w:val="left"/>
+      <w:pPr>
+        <w:ind w:left="2880" w:hanging="360"/>
+      </w:pPr>
+      <w:rPr>
+        <w:rFonts w:ascii="Symbol" w:hAnsi="Symbol" w:hint="default"/>
+      </w:rPr>
+    </w:lvl>
+    <w:lvl w:ilvl="4" w:tplc="0C090003" w:tentative="1">
+      <w:start w:val="1"/>
+      <w:numFmt w:val="bullet"/>
+      <w:lvlText w:val="o"/>
+      <w:lvlJc w:val="left"/>
+      <w:pPr>
+        <w:ind w:left="3600" w:hanging="360"/>
+      </w:pPr>
+      <w:rPr>
+        <w:rFonts w:ascii="Courier New" w:hAnsi="Courier New" w:cs="Courier New" w:hint="default"/>
+      </w:rPr>
+    </w:lvl>
+    <w:lvl w:ilvl="5" w:tplc="0C090005" w:tentative="1">
+      <w:start w:val="1"/>
+      <w:numFmt w:val="bullet"/>
+      <w:lvlText w:val=""/>
+      <w:lvlJc w:val="left"/>
+      <w:pPr>
+        <w:ind w:left="4320" w:hanging="360"/>
+      </w:pPr>
+      <w:rPr>
+        <w:rFonts w:ascii="Wingdings" w:hAnsi="Wingdings" w:hint="default"/>
+      </w:rPr>
+    </w:lvl>
+    <w:lvl w:ilvl="6" w:tplc="0C090001" w:tentative="1">
+      <w:start w:val="1"/>
+      <w:numFmt w:val="bullet"/>
+      <w:lvlText w:val=""/>
+      <w:lvlJc w:val="left"/>
+      <w:pPr>
+        <w:ind w:left="5040" w:hanging="360"/>
+      </w:pPr>
+      <w:rPr>
+        <w:rFonts w:ascii="Symbol" w:hAnsi="Symbol" w:hint="default"/>
+      </w:rPr>
+    </w:lvl>
+    <w:lvl w:ilvl="7" w:tplc="0C090003" w:tentative="1">
+      <w:start w:val="1"/>
+      <w:numFmt w:val="bullet"/>
+      <w:lvlText w:val="o"/>
+      <w:lvlJc w:val="left"/>
+      <w:pPr>
+        <w:ind w:left="5760" w:hanging="360"/>
+      </w:pPr>
+      <w:rPr>
+        <w:rFonts w:ascii="Courier New" w:hAnsi="Courier New" w:cs="Courier New" w:hint="default"/>
+      </w:rPr>
+    </w:lvl>
+    <w:lvl w:ilvl="8" w:tplc="0C090005" w:tentative="1">
+      <w:start w:val="1"/>
+      <w:numFmt w:val="bullet"/>
+      <w:lvlText w:val=""/>
+      <w:lvlJc w:val="left"/>
+      <w:pPr>
+        <w:ind w:left="6480" w:hanging="360"/>
+      </w:pPr>
+      <w:rPr>
+        <w:rFonts w:ascii="Wingdings" w:hAnsi="Wingdings" w:hint="default"/>
+      </w:rPr>
+    </w:lvl>
+  </w:abstractNum>
+  <w:abstractNum w:abstractNumId="18" w15:restartNumberingAfterBreak="0">
+    <w:nsid w:val="7E4166F9"/>
+    <w:multiLevelType w:val="multilevel"/>
+    <w:tmpl w:val="3A5AD6C6"/>
+    <w:lvl w:ilvl="0">
+      <w:start w:val="1"/>
+      <w:numFmt w:val="bullet"/>
+      <w:lvlText w:val="o"/>
+      <w:lvlJc w:val="left"/>
+      <w:pPr>
+        <w:tabs>
+          <w:tab w:val="num" w:pos="720"/>
+        </w:tabs>
+        <w:ind w:left="720" w:hanging="360"/>
+      </w:pPr>
+      <w:rPr>
+        <w:rFonts w:ascii="Courier New" w:hAnsi="Courier New" w:hint="default"/>
+        <w:sz w:val="20"/>
+      </w:rPr>
+    </w:lvl>
+    <w:lvl w:ilvl="1">
+      <w:start w:val="1"/>
+      <w:numFmt w:val="bullet"/>
+      <w:lvlText w:val=""/>
+      <w:lvlJc w:val="left"/>
+      <w:pPr>
+        <w:tabs>
+          <w:tab w:val="num" w:pos="1440"/>
+        </w:tabs>
+        <w:ind w:left="1440" w:hanging="360"/>
+      </w:pPr>
+      <w:rPr>
+        <w:rFonts w:ascii="Symbol" w:hAnsi="Symbol" w:hint="default"/>
+        <w:sz w:val="20"/>
+      </w:rPr>
+    </w:lvl>
+    <w:lvl w:ilvl="2" w:tentative="1">
+      <w:start w:val="1"/>
+      <w:numFmt w:val="bullet"/>
+      <w:lvlText w:val="o"/>
+      <w:lvlJc w:val="left"/>
+      <w:pPr>
+        <w:tabs>
+          <w:tab w:val="num" w:pos="2160"/>
+        </w:tabs>
+        <w:ind w:left="2160" w:hanging="360"/>
+      </w:pPr>
+      <w:rPr>
+        <w:rFonts w:ascii="Courier New" w:hAnsi="Courier New" w:hint="default"/>
+        <w:sz w:val="20"/>
+      </w:rPr>
+    </w:lvl>
+    <w:lvl w:ilvl="3" w:tentative="1">
+      <w:start w:val="1"/>
+      <w:numFmt w:val="bullet"/>
+      <w:lvlText w:val="o"/>
+      <w:lvlJc w:val="left"/>
+      <w:pPr>
+        <w:tabs>
+          <w:tab w:val="num" w:pos="2880"/>
+        </w:tabs>
+        <w:ind w:left="2880" w:hanging="360"/>
+      </w:pPr>
+      <w:rPr>
+        <w:rFonts w:ascii="Courier New" w:hAnsi="Courier New" w:hint="default"/>
+        <w:sz w:val="20"/>
+      </w:rPr>
+    </w:lvl>
+    <w:lvl w:ilvl="4" w:tentative="1">
+      <w:start w:val="1"/>
+      <w:numFmt w:val="bullet"/>
+      <w:lvlText w:val="o"/>
+      <w:lvlJc w:val="left"/>
+      <w:pPr>
+        <w:tabs>
+          <w:tab w:val="num" w:pos="3600"/>
+        </w:tabs>
+        <w:ind w:left="3600" w:hanging="360"/>
+      </w:pPr>
+      <w:rPr>
+        <w:rFonts w:ascii="Courier New" w:hAnsi="Courier New" w:hint="default"/>
+        <w:sz w:val="20"/>
+      </w:rPr>
+    </w:lvl>
+    <w:lvl w:ilvl="5" w:tentative="1">
+      <w:start w:val="1"/>
+      <w:numFmt w:val="bullet"/>
+      <w:lvlText w:val="o"/>
+      <w:lvlJc w:val="left"/>
+      <w:pPr>
+        <w:tabs>
+          <w:tab w:val="num" w:pos="4320"/>
+        </w:tabs>
+        <w:ind w:left="4320" w:hanging="360"/>
+      </w:pPr>
+      <w:rPr>
+        <w:rFonts w:ascii="Courier New" w:hAnsi="Courier New" w:hint="default"/>
+        <w:sz w:val="20"/>
+      </w:rPr>
+    </w:lvl>
+    <w:lvl w:ilvl="6" w:tentative="1">
+      <w:start w:val="1"/>
+      <w:numFmt w:val="bullet"/>
+      <w:lvlText w:val="o"/>
+      <w:lvlJc w:val="left"/>
+      <w:pPr>
+        <w:tabs>
+          <w:tab w:val="num" w:pos="5040"/>
+        </w:tabs>
+        <w:ind w:left="5040" w:hanging="360"/>
+      </w:pPr>
+      <w:rPr>
+        <w:rFonts w:ascii="Courier New" w:hAnsi="Courier New" w:hint="default"/>
+        <w:sz w:val="20"/>
+      </w:rPr>
+    </w:lvl>
+    <w:lvl w:ilvl="7" w:tentative="1">
+      <w:start w:val="1"/>
+      <w:numFmt w:val="bullet"/>
+      <w:lvlText w:val="o"/>
+      <w:lvlJc w:val="left"/>
+      <w:pPr>
+        <w:tabs>
+          <w:tab w:val="num" w:pos="5760"/>
+        </w:tabs>
+        <w:ind w:left="5760" w:hanging="360"/>
+      </w:pPr>
+      <w:rPr>
+        <w:rFonts w:ascii="Courier New" w:hAnsi="Courier New" w:hint="default"/>
+        <w:sz w:val="20"/>
+      </w:rPr>
+    </w:lvl>
+    <w:lvl w:ilvl="8" w:tentative="1">
+      <w:start w:val="1"/>
+      <w:numFmt w:val="bullet"/>
+      <w:lvlText w:val="o"/>
+      <w:lvlJc w:val="left"/>
+      <w:pPr>
+        <w:tabs>
+          <w:tab w:val="num" w:pos="6480"/>
+        </w:tabs>
+        <w:ind w:left="6480" w:hanging="360"/>
+      </w:pPr>
+      <w:rPr>
+        <w:rFonts w:ascii="Courier New" w:hAnsi="Courier New" w:hint="default"/>
+        <w:sz w:val="20"/>
+      </w:rPr>
+    </w:lvl>
+  </w:abstractNum>
   <w:num w:numId="1" w16cid:durableId="1938515201">
+    <w:abstractNumId w:val="11"/>
+  </w:num>
+  <w:num w:numId="2" w16cid:durableId="1040859581">
+    <w:abstractNumId w:val="6"/>
+  </w:num>
+  <w:num w:numId="3" w16cid:durableId="399600028">
+    <w:abstractNumId w:val="7"/>
+  </w:num>
+  <w:num w:numId="4" w16cid:durableId="1509905035">
+    <w:abstractNumId w:val="13"/>
+  </w:num>
+  <w:num w:numId="5" w16cid:durableId="683870734">
+    <w:abstractNumId w:val="10"/>
+  </w:num>
+  <w:num w:numId="6" w16cid:durableId="1297834434">
+    <w:abstractNumId w:val="15"/>
+  </w:num>
+  <w:num w:numId="7" w16cid:durableId="76101251">
+    <w:abstractNumId w:val="5"/>
+  </w:num>
+  <w:num w:numId="8" w16cid:durableId="1344553206">
+    <w:abstractNumId w:val="17"/>
+  </w:num>
+  <w:num w:numId="9" w16cid:durableId="2079327291">
+    <w:abstractNumId w:val="18"/>
+  </w:num>
+  <w:num w:numId="10" w16cid:durableId="1618439832">
+    <w:abstractNumId w:val="9"/>
+  </w:num>
+  <w:num w:numId="11" w16cid:durableId="1492595138">
+    <w:abstractNumId w:val="4"/>
+  </w:num>
+  <w:num w:numId="12" w16cid:durableId="1487742014">
+    <w:abstractNumId w:val="1"/>
+  </w:num>
+  <w:num w:numId="13" w16cid:durableId="1830436898">
+    <w:abstractNumId w:val="3"/>
+  </w:num>
+  <w:num w:numId="14" w16cid:durableId="1232428328">
+    <w:abstractNumId w:val="12"/>
+  </w:num>
+  <w:num w:numId="15" w16cid:durableId="852377238">
     <w:abstractNumId w:val="2"/>
   </w:num>
-  <w:num w:numId="2" w16cid:durableId="1040859581">
+  <w:num w:numId="16" w16cid:durableId="1507865037">
+    <w:abstractNumId w:val="8"/>
+  </w:num>
+  <w:num w:numId="17" w16cid:durableId="1909874493">
     <w:abstractNumId w:val="0"/>
   </w:num>
-  <w:num w:numId="3" w16cid:durableId="399600028">
-    <w:abstractNumId w:val="1"/>
+  <w:num w:numId="18" w16cid:durableId="389890120">
+    <w:abstractNumId w:val="14"/>
   </w:num>
-  <w:num w:numId="4" w16cid:durableId="1509905035">
-    <w:abstractNumId w:val="3"/>
+  <w:num w:numId="19" w16cid:durableId="1197696573">
+    <w:abstractNumId w:val="16"/>
   </w:num>
   <w:numIdMacAtCleanup w:val="3"/>
 </w:numbering>
@@ -1071,7 +5091,11 @@
   <w:style w:type="paragraph" w:default="1" w:styleId="a">
     <w:name w:val="Normal"/>
     <w:qFormat/>
-    <w:rsid w:val="004C3E6F"/>
+    <w:rsid w:val="00996AFC"/>
+    <w:rPr>
+      <w:rFonts w:asciiTheme="majorHAnsi" w:hAnsiTheme="majorHAnsi"/>
+      <w:sz w:val="22"/>
+    </w:rPr>
   </w:style>
   <w:style w:type="paragraph" w:styleId="1">
     <w:name w:val="heading 1"/>
@@ -1091,7 +5115,7 @@
       <w:outlineLvl w:val="0"/>
     </w:pPr>
     <w:rPr>
-      <w:rFonts w:asciiTheme="majorHAnsi" w:eastAsiaTheme="majorEastAsia" w:hAnsiTheme="majorHAnsi" w:cstheme="majorBidi"/>
+      <w:rFonts w:eastAsiaTheme="majorEastAsia" w:cstheme="majorBidi"/>
       <w:color w:val="262626" w:themeColor="text1" w:themeTint="D9"/>
       <w:sz w:val="40"/>
       <w:szCs w:val="40"/>
@@ -1113,7 +5137,7 @@
       <w:outlineLvl w:val="1"/>
     </w:pPr>
     <w:rPr>
-      <w:rFonts w:asciiTheme="majorHAnsi" w:eastAsiaTheme="majorEastAsia" w:hAnsiTheme="majorHAnsi" w:cstheme="majorBidi"/>
+      <w:rFonts w:eastAsiaTheme="majorEastAsia" w:cstheme="majorBidi"/>
       <w:color w:val="C0504D" w:themeColor="accent2"/>
       <w:sz w:val="36"/>
       <w:szCs w:val="36"/>
@@ -1135,7 +5159,7 @@
       <w:outlineLvl w:val="2"/>
     </w:pPr>
     <w:rPr>
-      <w:rFonts w:asciiTheme="majorHAnsi" w:eastAsiaTheme="majorEastAsia" w:hAnsiTheme="majorHAnsi" w:cstheme="majorBidi"/>
+      <w:rFonts w:eastAsiaTheme="majorEastAsia" w:cstheme="majorBidi"/>
       <w:color w:val="943634" w:themeColor="accent2" w:themeShade="BF"/>
       <w:sz w:val="32"/>
       <w:szCs w:val="32"/>
@@ -1157,7 +5181,7 @@
       <w:outlineLvl w:val="3"/>
     </w:pPr>
     <w:rPr>
-      <w:rFonts w:asciiTheme="majorHAnsi" w:eastAsiaTheme="majorEastAsia" w:hAnsiTheme="majorHAnsi" w:cstheme="majorBidi"/>
+      <w:rFonts w:eastAsiaTheme="majorEastAsia" w:cstheme="majorBidi"/>
       <w:i/>
       <w:iCs/>
       <w:color w:val="632423" w:themeColor="accent2" w:themeShade="80"/>
@@ -1181,7 +5205,7 @@
       <w:outlineLvl w:val="4"/>
     </w:pPr>
     <w:rPr>
-      <w:rFonts w:asciiTheme="majorHAnsi" w:eastAsiaTheme="majorEastAsia" w:hAnsiTheme="majorHAnsi" w:cstheme="majorBidi"/>
+      <w:rFonts w:eastAsiaTheme="majorEastAsia" w:cstheme="majorBidi"/>
       <w:color w:val="943634" w:themeColor="accent2" w:themeShade="BF"/>
       <w:sz w:val="24"/>
       <w:szCs w:val="24"/>
@@ -1203,7 +5227,7 @@
       <w:outlineLvl w:val="5"/>
     </w:pPr>
     <w:rPr>
-      <w:rFonts w:asciiTheme="majorHAnsi" w:eastAsiaTheme="majorEastAsia" w:hAnsiTheme="majorHAnsi" w:cstheme="majorBidi"/>
+      <w:rFonts w:eastAsiaTheme="majorEastAsia" w:cstheme="majorBidi"/>
       <w:i/>
       <w:iCs/>
       <w:color w:val="632423" w:themeColor="accent2" w:themeShade="80"/>
@@ -1227,11 +5251,10 @@
       <w:outlineLvl w:val="6"/>
     </w:pPr>
     <w:rPr>
-      <w:rFonts w:asciiTheme="majorHAnsi" w:eastAsiaTheme="majorEastAsia" w:hAnsiTheme="majorHAnsi" w:cstheme="majorBidi"/>
+      <w:rFonts w:eastAsiaTheme="majorEastAsia" w:cstheme="majorBidi"/>
       <w:b/>
       <w:bCs/>
       <w:color w:val="632423" w:themeColor="accent2" w:themeShade="80"/>
-      <w:sz w:val="22"/>
       <w:szCs w:val="22"/>
     </w:rPr>
   </w:style>
@@ -1251,9 +5274,8 @@
       <w:outlineLvl w:val="7"/>
     </w:pPr>
     <w:rPr>
-      <w:rFonts w:asciiTheme="majorHAnsi" w:eastAsiaTheme="majorEastAsia" w:hAnsiTheme="majorHAnsi" w:cstheme="majorBidi"/>
+      <w:rFonts w:eastAsiaTheme="majorEastAsia" w:cstheme="majorBidi"/>
       <w:color w:val="632423" w:themeColor="accent2" w:themeShade="80"/>
-      <w:sz w:val="22"/>
       <w:szCs w:val="22"/>
     </w:rPr>
   </w:style>
@@ -1273,11 +5295,10 @@
       <w:outlineLvl w:val="8"/>
     </w:pPr>
     <w:rPr>
-      <w:rFonts w:asciiTheme="majorHAnsi" w:eastAsiaTheme="majorEastAsia" w:hAnsiTheme="majorHAnsi" w:cstheme="majorBidi"/>
+      <w:rFonts w:eastAsiaTheme="majorEastAsia" w:cstheme="majorBidi"/>
       <w:i/>
       <w:iCs/>
       <w:color w:val="632423" w:themeColor="accent2" w:themeShade="80"/>
-      <w:sz w:val="22"/>
       <w:szCs w:val="22"/>
     </w:rPr>
   </w:style>
@@ -1341,7 +5362,7 @@
       <w:contextualSpacing/>
     </w:pPr>
     <w:rPr>
-      <w:rFonts w:asciiTheme="majorHAnsi" w:eastAsiaTheme="majorEastAsia" w:hAnsiTheme="majorHAnsi" w:cstheme="majorBidi"/>
+      <w:rFonts w:eastAsiaTheme="majorEastAsia" w:cstheme="majorBidi"/>
       <w:color w:val="262626" w:themeColor="text1" w:themeTint="D9"/>
       <w:sz w:val="96"/>
       <w:szCs w:val="96"/>
@@ -2241,7 +6262,7 @@
       <w:jc w:val="center"/>
     </w:pPr>
     <w:rPr>
-      <w:rFonts w:asciiTheme="majorHAnsi" w:eastAsiaTheme="majorEastAsia" w:hAnsiTheme="majorHAnsi" w:cstheme="majorBidi"/>
+      <w:rFonts w:eastAsiaTheme="majorEastAsia" w:cstheme="majorBidi"/>
       <w:color w:val="000000" w:themeColor="text1"/>
       <w:sz w:val="24"/>
       <w:szCs w:val="24"/>
@@ -2277,7 +6298,7 @@
       <w:jc w:val="center"/>
     </w:pPr>
     <w:rPr>
-      <w:rFonts w:asciiTheme="majorHAnsi" w:eastAsiaTheme="majorEastAsia" w:hAnsiTheme="majorHAnsi" w:cstheme="majorBidi"/>
+      <w:rFonts w:eastAsiaTheme="majorEastAsia" w:cstheme="majorBidi"/>
       <w:sz w:val="24"/>
       <w:szCs w:val="24"/>
     </w:rPr>

</xml_diff>